<commit_message>
Keep workflow decisions and tables readable across report sizes
</commit_message>
<xml_diff>
--- a/Website/static/downloads/showcase/pswriteoffice/budget-forecast-review.docx
+++ b/Website/static/downloads/showcase/pswriteoffice/budget-forecast-review.docx
@@ -30,6 +30,48 @@
       </w:r>
     </w:p>
     <w:p>
+      <w:pPr/>
+      <w:r>
+        <w:t xml:space="preserve">Positive variance is overspend; negative is favorable. The workbook retains detail, formulas and input validation. Regenerate this dated review after changing the CSV.</w:t>
+      </w:r>
+    </w:p>
+    <w:p>
+      <w:pPr>
+        <w:pStyle w:val="Heading1"/>
+        <w:keepNext/>
+        <w:spacing w:before="240" w:after="120"/>
+      </w:pPr>
+      <w:r>
+        <w:t xml:space="preserve">Owner decisions</w:t>
+      </w:r>
+    </w:p>
+    <w:p>
+      <w:pPr>
+        <w:pStyle w:val="ListParagraph"/>
+        <w:keepLines/>
+        <w:numPr>
+          <w:ilvl w:val="0"/>
+          <w:numId w:val="1"/>
+        </w:numPr>
+      </w:pPr>
+      <w:r>
+        <w:t xml:space="preserve">New service pilot | Chloé: Request a separate decision for the unbudgeted pilot. Forecast overspend $5,000.00.</w:t>
+      </w:r>
+    </w:p>
+    <w:p>
+      <w:pPr>
+        <w:pStyle w:val="ListParagraph"/>
+        <w:keepLines/>
+        <w:numPr>
+          <w:ilvl w:val="0"/>
+          <w:numId w:val="1"/>
+        </w:numPr>
+      </w:pPr>
+      <w:r>
+        <w:t xml:space="preserve">Operations | Markus: Approve a recovery plan for hosting costs. Forecast overspend $4,000.00.</w:t>
+      </w:r>
+    </w:p>
+    <w:p>
       <w:pPr>
         <w:pStyle w:val="Heading1"/>
         <w:keepNext/>
@@ -53,6 +95,10 @@
         <w:gridCol w:w="2340"/>
       </w:tblGrid>
       <w:tr>
+        <w:trPr>
+          <w:cantSplit/>
+          <w:tblHeader/>
+        </w:trPr>
         <w:tc>
           <w:tcPr>
             <w:tcW w:w="1250" w:type="pct"/>
@@ -123,6 +169,9 @@
         </w:tc>
       </w:tr>
       <w:tr>
+        <w:trPr>
+          <w:cantSplit/>
+        </w:trPr>
         <w:tc>
           <w:tcPr>
             <w:tcW w:w="1250" w:type="pct"/>
@@ -193,6 +242,9 @@
         </w:tc>
       </w:tr>
       <w:tr>
+        <w:trPr>
+          <w:cantSplit/>
+        </w:trPr>
         <w:tc>
           <w:tcPr>
             <w:tcW w:w="1250" w:type="pct"/>
@@ -263,6 +315,9 @@
         </w:tc>
       </w:tr>
       <w:tr>
+        <w:trPr>
+          <w:cantSplit/>
+        </w:trPr>
         <w:tc>
           <w:tcPr>
             <w:tcW w:w="1250" w:type="pct"/>
@@ -333,6 +388,9 @@
         </w:tc>
       </w:tr>
       <w:tr>
+        <w:trPr>
+          <w:cantSplit/>
+        </w:trPr>
         <w:tc>
           <w:tcPr>
             <w:tcW w:w="1250" w:type="pct"/>
@@ -403,6 +461,9 @@
         </w:tc>
       </w:tr>
       <w:tr>
+        <w:trPr>
+          <w:cantSplit/>
+        </w:trPr>
         <w:tc>
           <w:tcPr>
             <w:tcW w:w="1250" w:type="pct"/>
@@ -473,6 +534,9 @@
         </w:tc>
       </w:tr>
       <w:tr>
+        <w:trPr>
+          <w:cantSplit/>
+        </w:trPr>
         <w:tc>
           <w:tcPr>
             <w:tcW w:w="1250" w:type="pct"/>
@@ -543,49 +607,9 @@
         </w:tc>
       </w:tr>
     </w:tbl>
-    <w:p>
-      <w:pPr>
-        <w:pStyle w:val="Heading1"/>
-        <w:keepNext/>
-        <w:spacing w:before="240" w:after="120"/>
-      </w:pPr>
-      <w:r>
-        <w:t xml:space="preserve">Owner decisions</w:t>
-      </w:r>
-    </w:p>
-    <w:p>
-      <w:pPr>
-        <w:pStyle w:val="ListParagraph"/>
-        <w:numPr>
-          <w:ilvl w:val="0"/>
-          <w:numId w:val="1"/>
-        </w:numPr>
-      </w:pPr>
-      <w:r>
-        <w:t xml:space="preserve">New service pilot | Chloé: Request a separate decision for the unbudgeted pilot. Forecast overspend $5,000.00.</w:t>
-      </w:r>
-    </w:p>
-    <w:p>
-      <w:pPr>
-        <w:pStyle w:val="ListParagraph"/>
-        <w:numPr>
-          <w:ilvl w:val="0"/>
-          <w:numId w:val="1"/>
-        </w:numPr>
-      </w:pPr>
-      <w:r>
-        <w:t xml:space="preserve">Operations | Markus: Approve a recovery plan for hosting costs. Forecast overspend $4,000.00.</w:t>
-      </w:r>
-    </w:p>
-    <w:p>
-      <w:pPr/>
-      <w:r>
-        <w:t xml:space="preserve">Synthetic sample data. Amounts are USD; negative variance is favorable. The editable workbook retains the detail, formulas and input validation. Regenerate this review after changing the input.</w:t>
-      </w:r>
-    </w:p>
     <w:sectPr>
-      <w:headerReference w:type="default" r:id="Rde7e0141aa5c4a2e"/>
-      <w:footerReference w:type="default" r:id="Rbea5ddc5e47642b8"/>
+      <w:headerReference w:type="default" r:id="Rcf5455d4393a4721"/>
+      <w:footerReference w:type="default" r:id="R3d72d9168d7143c3"/>
       <w:pgSz w:w="12240" w:h="15840" w:code="1"/>
       <w:pgMar w:top="1440" w:right="1440" w:bottom="1440" w:left="1440" w:header="720" w:footer="720" w:gutter="0"/>
     </w:sectPr>
@@ -654,7 +678,7 @@
   <w:p>
     <w:pPr/>
     <w:r>
-      <w:t xml:space="preserve">FINANCE | Review at 2026-09-30</w:t>
+      <w:t xml:space="preserve">FINANCE | Synthetic USD sample | 2026-09-30</w:t>
     </w:r>
   </w:p>
 </w:hdr>
@@ -663,7 +687,7 @@
 <file path=word/numbering.xml><?xml version="1.0" encoding="utf-8"?>
 <w:numbering xmlns:wpc="http://schemas.microsoft.com/office/word/2010/wordprocessingCanvas" xmlns:cx="http://schemas.microsoft.com/office/drawing/2014/chartex" xmlns:cx1="http://schemas.microsoft.com/office/drawing/2015/9/8/chartex" xmlns:cx2="http://schemas.microsoft.com/office/drawing/2015/10/21/chartex" xmlns:cx3="http://schemas.microsoft.com/office/drawing/2016/5/9/chartex" xmlns:cx4="http://schemas.microsoft.com/office/drawing/2016/5/10/chartex" xmlns:cx5="http://schemas.microsoft.com/office/drawing/2016/5/11/chartex" xmlns:cx6="http://schemas.microsoft.com/office/drawing/2016/5/12/chartex" xmlns:cx7="http://schemas.microsoft.com/office/drawing/2016/5/13/chartex" xmlns:cx8="http://schemas.microsoft.com/office/drawing/2016/5/14/chartex" xmlns:mc="http://schemas.openxmlformats.org/markup-compatibility/2006" xmlns:aink="http://schemas.microsoft.com/office/drawing/2016/ink" xmlns:am3d="http://schemas.microsoft.com/office/drawing/2017/model3d" xmlns:o="urn:schemas-microsoft-com:office:office" xmlns:oel="http://schemas.microsoft.com/office/2019/extlst" xmlns:r="http://schemas.openxmlformats.org/officeDocument/2006/relationships" xmlns:m="http://schemas.openxmlformats.org/officeDocument/2006/math" xmlns:v="urn:schemas-microsoft-com:vml" xmlns:wp14="http://schemas.microsoft.com/office/word/2010/wordprocessingDrawing" xmlns:wp="http://schemas.openxmlformats.org/drawingml/2006/wordprocessingDrawing" xmlns:w10="urn:schemas-microsoft-com:office:word" xmlns:w="http://schemas.openxmlformats.org/wordprocessingml/2006/main" xmlns:w14="http://schemas.microsoft.com/office/word/2010/wordml" xmlns:w15="http://schemas.microsoft.com/office/word/2012/wordml" xmlns:w16cex="http://schemas.microsoft.com/office/word/2018/wordml/cex" xmlns:w16cid="http://schemas.microsoft.com/office/word/2016/wordml/cid" xmlns:w16="http://schemas.microsoft.com/office/word/2018/wordml" xmlns:w16sdtdh="http://schemas.microsoft.com/office/word/2020/wordml/sdtdatahash" xmlns:w16se="http://schemas.microsoft.com/office/word/2015/wordml/symex" xmlns:wpg="http://schemas.microsoft.com/office/word/2010/wordprocessingGroup" xmlns:wpi="http://schemas.microsoft.com/office/word/2010/wordprocessingInk" xmlns:wne="http://schemas.microsoft.com/office/word/2006/wordml" xmlns:wps="http://schemas.microsoft.com/office/word/2010/wordprocessingShape" mc:Ignorable="w14 w15 w16se w16cid w16 w16cex w16sdtdh wp14">
   <w:abstractNum w:abstractNumId="0" w15:restartNumberingAfterBreak="0">
-    <w:nsid w:val="9164336B"/>
+    <w:nsid w:val="FE11459B"/>
     <w:multiLevelType w:val="hybridMultilevel"/>
     <w:tmpl w:val="934E79A6"/>
     <w:lvl w:ilvl="0" w:tplc="04090001">

</xml_diff>

<commit_message>
Identify sample input separately from custom report data
</commit_message>
<xml_diff>
--- a/Website/static/downloads/showcase/pswriteoffice/budget-forecast-review.docx
+++ b/Website/static/downloads/showcase/pswriteoffice/budget-forecast-review.docx
@@ -608,8 +608,8 @@
       </w:tr>
     </w:tbl>
     <w:sectPr>
-      <w:headerReference w:type="default" r:id="Rcf5455d4393a4721"/>
-      <w:footerReference w:type="default" r:id="R3d72d9168d7143c3"/>
+      <w:headerReference w:type="default" r:id="R82b3a835d4ee4856"/>
+      <w:footerReference w:type="default" r:id="R7185e1b1e2724af8"/>
       <w:pgSz w:w="12240" w:h="15840" w:code="1"/>
       <w:pgMar w:top="1440" w:right="1440" w:bottom="1440" w:left="1440" w:header="720" w:footer="720" w:gutter="0"/>
     </w:sectPr>
@@ -687,7 +687,7 @@
 <file path=word/numbering.xml><?xml version="1.0" encoding="utf-8"?>
 <w:numbering xmlns:wpc="http://schemas.microsoft.com/office/word/2010/wordprocessingCanvas" xmlns:cx="http://schemas.microsoft.com/office/drawing/2014/chartex" xmlns:cx1="http://schemas.microsoft.com/office/drawing/2015/9/8/chartex" xmlns:cx2="http://schemas.microsoft.com/office/drawing/2015/10/21/chartex" xmlns:cx3="http://schemas.microsoft.com/office/drawing/2016/5/9/chartex" xmlns:cx4="http://schemas.microsoft.com/office/drawing/2016/5/10/chartex" xmlns:cx5="http://schemas.microsoft.com/office/drawing/2016/5/11/chartex" xmlns:cx6="http://schemas.microsoft.com/office/drawing/2016/5/12/chartex" xmlns:cx7="http://schemas.microsoft.com/office/drawing/2016/5/13/chartex" xmlns:cx8="http://schemas.microsoft.com/office/drawing/2016/5/14/chartex" xmlns:mc="http://schemas.openxmlformats.org/markup-compatibility/2006" xmlns:aink="http://schemas.microsoft.com/office/drawing/2016/ink" xmlns:am3d="http://schemas.microsoft.com/office/drawing/2017/model3d" xmlns:o="urn:schemas-microsoft-com:office:office" xmlns:oel="http://schemas.microsoft.com/office/2019/extlst" xmlns:r="http://schemas.openxmlformats.org/officeDocument/2006/relationships" xmlns:m="http://schemas.openxmlformats.org/officeDocument/2006/math" xmlns:v="urn:schemas-microsoft-com:vml" xmlns:wp14="http://schemas.microsoft.com/office/word/2010/wordprocessingDrawing" xmlns:wp="http://schemas.openxmlformats.org/drawingml/2006/wordprocessingDrawing" xmlns:w10="urn:schemas-microsoft-com:office:word" xmlns:w="http://schemas.openxmlformats.org/wordprocessingml/2006/main" xmlns:w14="http://schemas.microsoft.com/office/word/2010/wordml" xmlns:w15="http://schemas.microsoft.com/office/word/2012/wordml" xmlns:w16cex="http://schemas.microsoft.com/office/word/2018/wordml/cex" xmlns:w16cid="http://schemas.microsoft.com/office/word/2016/wordml/cid" xmlns:w16="http://schemas.microsoft.com/office/word/2018/wordml" xmlns:w16sdtdh="http://schemas.microsoft.com/office/word/2020/wordml/sdtdatahash" xmlns:w16se="http://schemas.microsoft.com/office/word/2015/wordml/symex" xmlns:wpg="http://schemas.microsoft.com/office/word/2010/wordprocessingGroup" xmlns:wpi="http://schemas.microsoft.com/office/word/2010/wordprocessingInk" xmlns:wne="http://schemas.microsoft.com/office/word/2006/wordml" xmlns:wps="http://schemas.microsoft.com/office/word/2010/wordprocessingShape" mc:Ignorable="w14 w15 w16se w16cid w16 w16cex w16sdtdh wp14">
   <w:abstractNum w:abstractNumId="0" w15:restartNumberingAfterBreak="0">
-    <w:nsid w:val="FE11459B"/>
+    <w:nsid w:val="96946190"/>
     <w:multiLevelType w:val="hybridMultilevel"/>
     <w:tmpl w:val="934E79A6"/>
     <w:lvl w:ilvl="0" w:tplc="04090001">

</xml_diff>

<commit_message>
Reject ambiguous amounts in budget forecast inputs
</commit_message>
<xml_diff>
--- a/Website/static/downloads/showcase/pswriteoffice/budget-forecast-review.docx
+++ b/Website/static/downloads/showcase/pswriteoffice/budget-forecast-review.docx
@@ -608,8 +608,8 @@
       </w:tr>
     </w:tbl>
     <w:sectPr>
-      <w:headerReference w:type="default" r:id="R82b3a835d4ee4856"/>
-      <w:footerReference w:type="default" r:id="R7185e1b1e2724af8"/>
+      <w:headerReference w:type="default" r:id="R9fbcf6797f14454d"/>
+      <w:footerReference w:type="default" r:id="Rd78c79a92fcd40ac"/>
       <w:pgSz w:w="12240" w:h="15840" w:code="1"/>
       <w:pgMar w:top="1440" w:right="1440" w:bottom="1440" w:left="1440" w:header="720" w:footer="720" w:gutter="0"/>
     </w:sectPr>
@@ -687,7 +687,7 @@
 <file path=word/numbering.xml><?xml version="1.0" encoding="utf-8"?>
 <w:numbering xmlns:wpc="http://schemas.microsoft.com/office/word/2010/wordprocessingCanvas" xmlns:cx="http://schemas.microsoft.com/office/drawing/2014/chartex" xmlns:cx1="http://schemas.microsoft.com/office/drawing/2015/9/8/chartex" xmlns:cx2="http://schemas.microsoft.com/office/drawing/2015/10/21/chartex" xmlns:cx3="http://schemas.microsoft.com/office/drawing/2016/5/9/chartex" xmlns:cx4="http://schemas.microsoft.com/office/drawing/2016/5/10/chartex" xmlns:cx5="http://schemas.microsoft.com/office/drawing/2016/5/11/chartex" xmlns:cx6="http://schemas.microsoft.com/office/drawing/2016/5/12/chartex" xmlns:cx7="http://schemas.microsoft.com/office/drawing/2016/5/13/chartex" xmlns:cx8="http://schemas.microsoft.com/office/drawing/2016/5/14/chartex" xmlns:mc="http://schemas.openxmlformats.org/markup-compatibility/2006" xmlns:aink="http://schemas.microsoft.com/office/drawing/2016/ink" xmlns:am3d="http://schemas.microsoft.com/office/drawing/2017/model3d" xmlns:o="urn:schemas-microsoft-com:office:office" xmlns:oel="http://schemas.microsoft.com/office/2019/extlst" xmlns:r="http://schemas.openxmlformats.org/officeDocument/2006/relationships" xmlns:m="http://schemas.openxmlformats.org/officeDocument/2006/math" xmlns:v="urn:schemas-microsoft-com:vml" xmlns:wp14="http://schemas.microsoft.com/office/word/2010/wordprocessingDrawing" xmlns:wp="http://schemas.openxmlformats.org/drawingml/2006/wordprocessingDrawing" xmlns:w10="urn:schemas-microsoft-com:office:word" xmlns:w="http://schemas.openxmlformats.org/wordprocessingml/2006/main" xmlns:w14="http://schemas.microsoft.com/office/word/2010/wordml" xmlns:w15="http://schemas.microsoft.com/office/word/2012/wordml" xmlns:w16cex="http://schemas.microsoft.com/office/word/2018/wordml/cex" xmlns:w16cid="http://schemas.microsoft.com/office/word/2016/wordml/cid" xmlns:w16="http://schemas.microsoft.com/office/word/2018/wordml" xmlns:w16sdtdh="http://schemas.microsoft.com/office/word/2020/wordml/sdtdatahash" xmlns:w16se="http://schemas.microsoft.com/office/word/2015/wordml/symex" xmlns:wpg="http://schemas.microsoft.com/office/word/2010/wordprocessingGroup" xmlns:wpi="http://schemas.microsoft.com/office/word/2010/wordprocessingInk" xmlns:wne="http://schemas.microsoft.com/office/word/2006/wordml" xmlns:wps="http://schemas.microsoft.com/office/word/2010/wordprocessingShape" mc:Ignorable="w14 w15 w16se w16cid w16 w16cex w16sdtdh wp14">
   <w:abstractNum w:abstractNumId="0" w15:restartNumberingAfterBreak="0">
-    <w:nsid w:val="96946190"/>
+    <w:nsid w:val="1277B5B0"/>
     <w:multiLevelType w:val="hybridMultilevel"/>
     <w:tmpl w:val="934E79A6"/>
     <w:lvl w:ilvl="0" w:tplc="04090001">

</xml_diff>

<commit_message>
Record PowerShell showcase generation provenance
</commit_message>
<xml_diff>
--- a/Website/static/downloads/showcase/pswriteoffice/budget-forecast-review.docx
+++ b/Website/static/downloads/showcase/pswriteoffice/budget-forecast-review.docx
@@ -608,8 +608,8 @@
       </w:tr>
     </w:tbl>
     <w:sectPr>
-      <w:headerReference w:type="default" r:id="R9fbcf6797f14454d"/>
-      <w:footerReference w:type="default" r:id="Rd78c79a92fcd40ac"/>
+      <w:headerReference w:type="default" r:id="R70b4dc54ba4c42d4"/>
+      <w:footerReference w:type="default" r:id="Rc2880ceebc8c41fa"/>
       <w:pgSz w:w="12240" w:h="15840" w:code="1"/>
       <w:pgMar w:top="1440" w:right="1440" w:bottom="1440" w:left="1440" w:header="720" w:footer="720" w:gutter="0"/>
     </w:sectPr>
@@ -687,7 +687,7 @@
 <file path=word/numbering.xml><?xml version="1.0" encoding="utf-8"?>
 <w:numbering xmlns:wpc="http://schemas.microsoft.com/office/word/2010/wordprocessingCanvas" xmlns:cx="http://schemas.microsoft.com/office/drawing/2014/chartex" xmlns:cx1="http://schemas.microsoft.com/office/drawing/2015/9/8/chartex" xmlns:cx2="http://schemas.microsoft.com/office/drawing/2015/10/21/chartex" xmlns:cx3="http://schemas.microsoft.com/office/drawing/2016/5/9/chartex" xmlns:cx4="http://schemas.microsoft.com/office/drawing/2016/5/10/chartex" xmlns:cx5="http://schemas.microsoft.com/office/drawing/2016/5/11/chartex" xmlns:cx6="http://schemas.microsoft.com/office/drawing/2016/5/12/chartex" xmlns:cx7="http://schemas.microsoft.com/office/drawing/2016/5/13/chartex" xmlns:cx8="http://schemas.microsoft.com/office/drawing/2016/5/14/chartex" xmlns:mc="http://schemas.openxmlformats.org/markup-compatibility/2006" xmlns:aink="http://schemas.microsoft.com/office/drawing/2016/ink" xmlns:am3d="http://schemas.microsoft.com/office/drawing/2017/model3d" xmlns:o="urn:schemas-microsoft-com:office:office" xmlns:oel="http://schemas.microsoft.com/office/2019/extlst" xmlns:r="http://schemas.openxmlformats.org/officeDocument/2006/relationships" xmlns:m="http://schemas.openxmlformats.org/officeDocument/2006/math" xmlns:v="urn:schemas-microsoft-com:vml" xmlns:wp14="http://schemas.microsoft.com/office/word/2010/wordprocessingDrawing" xmlns:wp="http://schemas.openxmlformats.org/drawingml/2006/wordprocessingDrawing" xmlns:w10="urn:schemas-microsoft-com:office:word" xmlns:w="http://schemas.openxmlformats.org/wordprocessingml/2006/main" xmlns:w14="http://schemas.microsoft.com/office/word/2010/wordml" xmlns:w15="http://schemas.microsoft.com/office/word/2012/wordml" xmlns:w16cex="http://schemas.microsoft.com/office/word/2018/wordml/cex" xmlns:w16cid="http://schemas.microsoft.com/office/word/2016/wordml/cid" xmlns:w16="http://schemas.microsoft.com/office/word/2018/wordml" xmlns:w16sdtdh="http://schemas.microsoft.com/office/word/2020/wordml/sdtdatahash" xmlns:w16se="http://schemas.microsoft.com/office/word/2015/wordml/symex" xmlns:wpg="http://schemas.microsoft.com/office/word/2010/wordprocessingGroup" xmlns:wpi="http://schemas.microsoft.com/office/word/2010/wordprocessingInk" xmlns:wne="http://schemas.microsoft.com/office/word/2006/wordml" xmlns:wps="http://schemas.microsoft.com/office/word/2010/wordprocessingShape" mc:Ignorable="w14 w15 w16se w16cid w16 w16cex w16sdtdh wp14">
   <w:abstractNum w:abstractNumId="0" w15:restartNumberingAfterBreak="0">
-    <w:nsid w:val="1277B5B0"/>
+    <w:nsid w:val="44781457"/>
     <w:multiLevelType w:val="hybridMultilevel"/>
     <w:tmpl w:val="934E79A6"/>
     <w:lvl w:ilvl="0" w:tplc="04090001">

</xml_diff>

<commit_message>
Preserve exact showcase source bytes across checkouts
</commit_message>
<xml_diff>
--- a/Website/static/downloads/showcase/pswriteoffice/budget-forecast-review.docx
+++ b/Website/static/downloads/showcase/pswriteoffice/budget-forecast-review.docx
@@ -608,8 +608,8 @@
       </w:tr>
     </w:tbl>
     <w:sectPr>
-      <w:headerReference w:type="default" r:id="R70b4dc54ba4c42d4"/>
-      <w:footerReference w:type="default" r:id="Rc2880ceebc8c41fa"/>
+      <w:headerReference w:type="default" r:id="R133bb4bf447348e1"/>
+      <w:footerReference w:type="default" r:id="R469f3fca95074a48"/>
       <w:pgSz w:w="12240" w:h="15840" w:code="1"/>
       <w:pgMar w:top="1440" w:right="1440" w:bottom="1440" w:left="1440" w:header="720" w:footer="720" w:gutter="0"/>
     </w:sectPr>
@@ -687,7 +687,7 @@
 <file path=word/numbering.xml><?xml version="1.0" encoding="utf-8"?>
 <w:numbering xmlns:wpc="http://schemas.microsoft.com/office/word/2010/wordprocessingCanvas" xmlns:cx="http://schemas.microsoft.com/office/drawing/2014/chartex" xmlns:cx1="http://schemas.microsoft.com/office/drawing/2015/9/8/chartex" xmlns:cx2="http://schemas.microsoft.com/office/drawing/2015/10/21/chartex" xmlns:cx3="http://schemas.microsoft.com/office/drawing/2016/5/9/chartex" xmlns:cx4="http://schemas.microsoft.com/office/drawing/2016/5/10/chartex" xmlns:cx5="http://schemas.microsoft.com/office/drawing/2016/5/11/chartex" xmlns:cx6="http://schemas.microsoft.com/office/drawing/2016/5/12/chartex" xmlns:cx7="http://schemas.microsoft.com/office/drawing/2016/5/13/chartex" xmlns:cx8="http://schemas.microsoft.com/office/drawing/2016/5/14/chartex" xmlns:mc="http://schemas.openxmlformats.org/markup-compatibility/2006" xmlns:aink="http://schemas.microsoft.com/office/drawing/2016/ink" xmlns:am3d="http://schemas.microsoft.com/office/drawing/2017/model3d" xmlns:o="urn:schemas-microsoft-com:office:office" xmlns:oel="http://schemas.microsoft.com/office/2019/extlst" xmlns:r="http://schemas.openxmlformats.org/officeDocument/2006/relationships" xmlns:m="http://schemas.openxmlformats.org/officeDocument/2006/math" xmlns:v="urn:schemas-microsoft-com:vml" xmlns:wp14="http://schemas.microsoft.com/office/word/2010/wordprocessingDrawing" xmlns:wp="http://schemas.openxmlformats.org/drawingml/2006/wordprocessingDrawing" xmlns:w10="urn:schemas-microsoft-com:office:word" xmlns:w="http://schemas.openxmlformats.org/wordprocessingml/2006/main" xmlns:w14="http://schemas.microsoft.com/office/word/2010/wordml" xmlns:w15="http://schemas.microsoft.com/office/word/2012/wordml" xmlns:w16cex="http://schemas.microsoft.com/office/word/2018/wordml/cex" xmlns:w16cid="http://schemas.microsoft.com/office/word/2016/wordml/cid" xmlns:w16="http://schemas.microsoft.com/office/word/2018/wordml" xmlns:w16sdtdh="http://schemas.microsoft.com/office/word/2020/wordml/sdtdatahash" xmlns:w16se="http://schemas.microsoft.com/office/word/2015/wordml/symex" xmlns:wpg="http://schemas.microsoft.com/office/word/2010/wordprocessingGroup" xmlns:wpi="http://schemas.microsoft.com/office/word/2010/wordprocessingInk" xmlns:wne="http://schemas.microsoft.com/office/word/2006/wordml" xmlns:wps="http://schemas.microsoft.com/office/word/2010/wordprocessingShape" mc:Ignorable="w14 w15 w16se w16cid w16 w16cex w16sdtdh wp14">
   <w:abstractNum w:abstractNumId="0" w15:restartNumberingAfterBreak="0">
-    <w:nsid w:val="44781457"/>
+    <w:nsid w:val="AC999372"/>
     <w:multiLevelType w:val="hybridMultilevel"/>
     <w:tmpl w:val="934E79A6"/>
     <w:lvl w:ilvl="0" w:tplc="04090001">

</xml_diff>

<commit_message>
Bind showcase evidence to its executable producer
</commit_message>
<xml_diff>
--- a/Website/static/downloads/showcase/pswriteoffice/budget-forecast-review.docx
+++ b/Website/static/downloads/showcase/pswriteoffice/budget-forecast-review.docx
@@ -608,8 +608,8 @@
       </w:tr>
     </w:tbl>
     <w:sectPr>
-      <w:headerReference w:type="default" r:id="R133bb4bf447348e1"/>
-      <w:footerReference w:type="default" r:id="R469f3fca95074a48"/>
+      <w:headerReference w:type="default" r:id="R4c710645aa374cfa"/>
+      <w:footerReference w:type="default" r:id="R2486f7a3f27b4b4f"/>
       <w:pgSz w:w="12240" w:h="15840" w:code="1"/>
       <w:pgMar w:top="1440" w:right="1440" w:bottom="1440" w:left="1440" w:header="720" w:footer="720" w:gutter="0"/>
     </w:sectPr>
@@ -687,7 +687,7 @@
 <file path=word/numbering.xml><?xml version="1.0" encoding="utf-8"?>
 <w:numbering xmlns:wpc="http://schemas.microsoft.com/office/word/2010/wordprocessingCanvas" xmlns:cx="http://schemas.microsoft.com/office/drawing/2014/chartex" xmlns:cx1="http://schemas.microsoft.com/office/drawing/2015/9/8/chartex" xmlns:cx2="http://schemas.microsoft.com/office/drawing/2015/10/21/chartex" xmlns:cx3="http://schemas.microsoft.com/office/drawing/2016/5/9/chartex" xmlns:cx4="http://schemas.microsoft.com/office/drawing/2016/5/10/chartex" xmlns:cx5="http://schemas.microsoft.com/office/drawing/2016/5/11/chartex" xmlns:cx6="http://schemas.microsoft.com/office/drawing/2016/5/12/chartex" xmlns:cx7="http://schemas.microsoft.com/office/drawing/2016/5/13/chartex" xmlns:cx8="http://schemas.microsoft.com/office/drawing/2016/5/14/chartex" xmlns:mc="http://schemas.openxmlformats.org/markup-compatibility/2006" xmlns:aink="http://schemas.microsoft.com/office/drawing/2016/ink" xmlns:am3d="http://schemas.microsoft.com/office/drawing/2017/model3d" xmlns:o="urn:schemas-microsoft-com:office:office" xmlns:oel="http://schemas.microsoft.com/office/2019/extlst" xmlns:r="http://schemas.openxmlformats.org/officeDocument/2006/relationships" xmlns:m="http://schemas.openxmlformats.org/officeDocument/2006/math" xmlns:v="urn:schemas-microsoft-com:vml" xmlns:wp14="http://schemas.microsoft.com/office/word/2010/wordprocessingDrawing" xmlns:wp="http://schemas.openxmlformats.org/drawingml/2006/wordprocessingDrawing" xmlns:w10="urn:schemas-microsoft-com:office:word" xmlns:w="http://schemas.openxmlformats.org/wordprocessingml/2006/main" xmlns:w14="http://schemas.microsoft.com/office/word/2010/wordml" xmlns:w15="http://schemas.microsoft.com/office/word/2012/wordml" xmlns:w16cex="http://schemas.microsoft.com/office/word/2018/wordml/cex" xmlns:w16cid="http://schemas.microsoft.com/office/word/2016/wordml/cid" xmlns:w16="http://schemas.microsoft.com/office/word/2018/wordml" xmlns:w16sdtdh="http://schemas.microsoft.com/office/word/2020/wordml/sdtdatahash" xmlns:w16se="http://schemas.microsoft.com/office/word/2015/wordml/symex" xmlns:wpg="http://schemas.microsoft.com/office/word/2010/wordprocessingGroup" xmlns:wpi="http://schemas.microsoft.com/office/word/2010/wordprocessingInk" xmlns:wne="http://schemas.microsoft.com/office/word/2006/wordml" xmlns:wps="http://schemas.microsoft.com/office/word/2010/wordprocessingShape" mc:Ignorable="w14 w15 w16se w16cid w16 w16cex w16sdtdh wp14">
   <w:abstractNum w:abstractNumId="0" w15:restartNumberingAfterBreak="0">
-    <w:nsid w:val="AC999372"/>
+    <w:nsid w:val="95DB7FEB"/>
     <w:multiLevelType w:val="hybridMultilevel"/>
     <w:tmpl w:val="934E79A6"/>
     <w:lvl w:ilvl="0" w:tplc="04090001">

</xml_diff>

<commit_message>
Validate complete showcase receipts and separate preview review
</commit_message>
<xml_diff>
--- a/Website/static/downloads/showcase/pswriteoffice/budget-forecast-review.docx
+++ b/Website/static/downloads/showcase/pswriteoffice/budget-forecast-review.docx
@@ -608,8 +608,8 @@
       </w:tr>
     </w:tbl>
     <w:sectPr>
-      <w:headerReference w:type="default" r:id="R4c710645aa374cfa"/>
-      <w:footerReference w:type="default" r:id="R2486f7a3f27b4b4f"/>
+      <w:headerReference w:type="default" r:id="R29b9efe5bc5746a1"/>
+      <w:footerReference w:type="default" r:id="Ra693c92ed95c44a9"/>
       <w:pgSz w:w="12240" w:h="15840" w:code="1"/>
       <w:pgMar w:top="1440" w:right="1440" w:bottom="1440" w:left="1440" w:header="720" w:footer="720" w:gutter="0"/>
     </w:sectPr>
@@ -687,7 +687,7 @@
 <file path=word/numbering.xml><?xml version="1.0" encoding="utf-8"?>
 <w:numbering xmlns:wpc="http://schemas.microsoft.com/office/word/2010/wordprocessingCanvas" xmlns:cx="http://schemas.microsoft.com/office/drawing/2014/chartex" xmlns:cx1="http://schemas.microsoft.com/office/drawing/2015/9/8/chartex" xmlns:cx2="http://schemas.microsoft.com/office/drawing/2015/10/21/chartex" xmlns:cx3="http://schemas.microsoft.com/office/drawing/2016/5/9/chartex" xmlns:cx4="http://schemas.microsoft.com/office/drawing/2016/5/10/chartex" xmlns:cx5="http://schemas.microsoft.com/office/drawing/2016/5/11/chartex" xmlns:cx6="http://schemas.microsoft.com/office/drawing/2016/5/12/chartex" xmlns:cx7="http://schemas.microsoft.com/office/drawing/2016/5/13/chartex" xmlns:cx8="http://schemas.microsoft.com/office/drawing/2016/5/14/chartex" xmlns:mc="http://schemas.openxmlformats.org/markup-compatibility/2006" xmlns:aink="http://schemas.microsoft.com/office/drawing/2016/ink" xmlns:am3d="http://schemas.microsoft.com/office/drawing/2017/model3d" xmlns:o="urn:schemas-microsoft-com:office:office" xmlns:oel="http://schemas.microsoft.com/office/2019/extlst" xmlns:r="http://schemas.openxmlformats.org/officeDocument/2006/relationships" xmlns:m="http://schemas.openxmlformats.org/officeDocument/2006/math" xmlns:v="urn:schemas-microsoft-com:vml" xmlns:wp14="http://schemas.microsoft.com/office/word/2010/wordprocessingDrawing" xmlns:wp="http://schemas.openxmlformats.org/drawingml/2006/wordprocessingDrawing" xmlns:w10="urn:schemas-microsoft-com:office:word" xmlns:w="http://schemas.openxmlformats.org/wordprocessingml/2006/main" xmlns:w14="http://schemas.microsoft.com/office/word/2010/wordml" xmlns:w15="http://schemas.microsoft.com/office/word/2012/wordml" xmlns:w16cex="http://schemas.microsoft.com/office/word/2018/wordml/cex" xmlns:w16cid="http://schemas.microsoft.com/office/word/2016/wordml/cid" xmlns:w16="http://schemas.microsoft.com/office/word/2018/wordml" xmlns:w16sdtdh="http://schemas.microsoft.com/office/word/2020/wordml/sdtdatahash" xmlns:w16se="http://schemas.microsoft.com/office/word/2015/wordml/symex" xmlns:wpg="http://schemas.microsoft.com/office/word/2010/wordprocessingGroup" xmlns:wpi="http://schemas.microsoft.com/office/word/2010/wordprocessingInk" xmlns:wne="http://schemas.microsoft.com/office/word/2006/wordml" xmlns:wps="http://schemas.microsoft.com/office/word/2010/wordprocessingShape" mc:Ignorable="w14 w15 w16se w16cid w16 w16cex w16sdtdh wp14">
   <w:abstractNum w:abstractNumId="0" w15:restartNumberingAfterBreak="0">
-    <w:nsid w:val="95DB7FEB"/>
+    <w:nsid w:val="8C272A16"/>
     <w:multiLevelType w:val="hybridMultilevel"/>
     <w:tmpl w:val="934E79A6"/>
     <w:lvl w:ilvl="0" w:tplc="04090001">

</xml_diff>

<commit_message>
Bind showcase builder and run child evidence contracts in CI
</commit_message>
<xml_diff>
--- a/Website/static/downloads/showcase/pswriteoffice/budget-forecast-review.docx
+++ b/Website/static/downloads/showcase/pswriteoffice/budget-forecast-review.docx
@@ -608,8 +608,8 @@
       </w:tr>
     </w:tbl>
     <w:sectPr>
-      <w:headerReference w:type="default" r:id="R29b9efe5bc5746a1"/>
-      <w:footerReference w:type="default" r:id="Ra693c92ed95c44a9"/>
+      <w:headerReference w:type="default" r:id="Rbf9c9e9eaf794d95"/>
+      <w:footerReference w:type="default" r:id="Rdf9f90f8db414fc3"/>
       <w:pgSz w:w="12240" w:h="15840" w:code="1"/>
       <w:pgMar w:top="1440" w:right="1440" w:bottom="1440" w:left="1440" w:header="720" w:footer="720" w:gutter="0"/>
     </w:sectPr>
@@ -687,7 +687,7 @@
 <file path=word/numbering.xml><?xml version="1.0" encoding="utf-8"?>
 <w:numbering xmlns:wpc="http://schemas.microsoft.com/office/word/2010/wordprocessingCanvas" xmlns:cx="http://schemas.microsoft.com/office/drawing/2014/chartex" xmlns:cx1="http://schemas.microsoft.com/office/drawing/2015/9/8/chartex" xmlns:cx2="http://schemas.microsoft.com/office/drawing/2015/10/21/chartex" xmlns:cx3="http://schemas.microsoft.com/office/drawing/2016/5/9/chartex" xmlns:cx4="http://schemas.microsoft.com/office/drawing/2016/5/10/chartex" xmlns:cx5="http://schemas.microsoft.com/office/drawing/2016/5/11/chartex" xmlns:cx6="http://schemas.microsoft.com/office/drawing/2016/5/12/chartex" xmlns:cx7="http://schemas.microsoft.com/office/drawing/2016/5/13/chartex" xmlns:cx8="http://schemas.microsoft.com/office/drawing/2016/5/14/chartex" xmlns:mc="http://schemas.openxmlformats.org/markup-compatibility/2006" xmlns:aink="http://schemas.microsoft.com/office/drawing/2016/ink" xmlns:am3d="http://schemas.microsoft.com/office/drawing/2017/model3d" xmlns:o="urn:schemas-microsoft-com:office:office" xmlns:oel="http://schemas.microsoft.com/office/2019/extlst" xmlns:r="http://schemas.openxmlformats.org/officeDocument/2006/relationships" xmlns:m="http://schemas.openxmlformats.org/officeDocument/2006/math" xmlns:v="urn:schemas-microsoft-com:vml" xmlns:wp14="http://schemas.microsoft.com/office/word/2010/wordprocessingDrawing" xmlns:wp="http://schemas.openxmlformats.org/drawingml/2006/wordprocessingDrawing" xmlns:w10="urn:schemas-microsoft-com:office:word" xmlns:w="http://schemas.openxmlformats.org/wordprocessingml/2006/main" xmlns:w14="http://schemas.microsoft.com/office/word/2010/wordml" xmlns:w15="http://schemas.microsoft.com/office/word/2012/wordml" xmlns:w16cex="http://schemas.microsoft.com/office/word/2018/wordml/cex" xmlns:w16cid="http://schemas.microsoft.com/office/word/2016/wordml/cid" xmlns:w16="http://schemas.microsoft.com/office/word/2018/wordml" xmlns:w16sdtdh="http://schemas.microsoft.com/office/word/2020/wordml/sdtdatahash" xmlns:w16se="http://schemas.microsoft.com/office/word/2015/wordml/symex" xmlns:wpg="http://schemas.microsoft.com/office/word/2010/wordprocessingGroup" xmlns:wpi="http://schemas.microsoft.com/office/word/2010/wordprocessingInk" xmlns:wne="http://schemas.microsoft.com/office/word/2006/wordml" xmlns:wps="http://schemas.microsoft.com/office/word/2010/wordprocessingShape" mc:Ignorable="w14 w15 w16se w16cid w16 w16cex w16sdtdh wp14">
   <w:abstractNum w:abstractNumId="0" w15:restartNumberingAfterBreak="0">
-    <w:nsid w:val="8C272A16"/>
+    <w:nsid w:val="2BDF1237"/>
     <w:multiLevelType w:val="hybridMultilevel"/>
     <w:tmpl w:val="934E79A6"/>
     <w:lvl w:ilvl="0" w:tplc="04090001">

</xml_diff>

<commit_message>
Run workflow examples with installed modules and downloaded CSV inputs
</commit_message>
<xml_diff>
--- a/Website/static/downloads/showcase/pswriteoffice/budget-forecast-review.docx
+++ b/Website/static/downloads/showcase/pswriteoffice/budget-forecast-review.docx
@@ -608,8 +608,8 @@
       </w:tr>
     </w:tbl>
     <w:sectPr>
-      <w:headerReference w:type="default" r:id="Rbf9c9e9eaf794d95"/>
-      <w:footerReference w:type="default" r:id="Rdf9f90f8db414fc3"/>
+      <w:headerReference w:type="default" r:id="R53060477aa0d493b"/>
+      <w:footerReference w:type="default" r:id="R0049724e20b84579"/>
       <w:pgSz w:w="12240" w:h="15840" w:code="1"/>
       <w:pgMar w:top="1440" w:right="1440" w:bottom="1440" w:left="1440" w:header="720" w:footer="720" w:gutter="0"/>
     </w:sectPr>
@@ -687,7 +687,7 @@
 <file path=word/numbering.xml><?xml version="1.0" encoding="utf-8"?>
 <w:numbering xmlns:wpc="http://schemas.microsoft.com/office/word/2010/wordprocessingCanvas" xmlns:cx="http://schemas.microsoft.com/office/drawing/2014/chartex" xmlns:cx1="http://schemas.microsoft.com/office/drawing/2015/9/8/chartex" xmlns:cx2="http://schemas.microsoft.com/office/drawing/2015/10/21/chartex" xmlns:cx3="http://schemas.microsoft.com/office/drawing/2016/5/9/chartex" xmlns:cx4="http://schemas.microsoft.com/office/drawing/2016/5/10/chartex" xmlns:cx5="http://schemas.microsoft.com/office/drawing/2016/5/11/chartex" xmlns:cx6="http://schemas.microsoft.com/office/drawing/2016/5/12/chartex" xmlns:cx7="http://schemas.microsoft.com/office/drawing/2016/5/13/chartex" xmlns:cx8="http://schemas.microsoft.com/office/drawing/2016/5/14/chartex" xmlns:mc="http://schemas.openxmlformats.org/markup-compatibility/2006" xmlns:aink="http://schemas.microsoft.com/office/drawing/2016/ink" xmlns:am3d="http://schemas.microsoft.com/office/drawing/2017/model3d" xmlns:o="urn:schemas-microsoft-com:office:office" xmlns:oel="http://schemas.microsoft.com/office/2019/extlst" xmlns:r="http://schemas.openxmlformats.org/officeDocument/2006/relationships" xmlns:m="http://schemas.openxmlformats.org/officeDocument/2006/math" xmlns:v="urn:schemas-microsoft-com:vml" xmlns:wp14="http://schemas.microsoft.com/office/word/2010/wordprocessingDrawing" xmlns:wp="http://schemas.openxmlformats.org/drawingml/2006/wordprocessingDrawing" xmlns:w10="urn:schemas-microsoft-com:office:word" xmlns:w="http://schemas.openxmlformats.org/wordprocessingml/2006/main" xmlns:w14="http://schemas.microsoft.com/office/word/2010/wordml" xmlns:w15="http://schemas.microsoft.com/office/word/2012/wordml" xmlns:w16cex="http://schemas.microsoft.com/office/word/2018/wordml/cex" xmlns:w16cid="http://schemas.microsoft.com/office/word/2016/wordml/cid" xmlns:w16="http://schemas.microsoft.com/office/word/2018/wordml" xmlns:w16sdtdh="http://schemas.microsoft.com/office/word/2020/wordml/sdtdatahash" xmlns:w16se="http://schemas.microsoft.com/office/word/2015/wordml/symex" xmlns:wpg="http://schemas.microsoft.com/office/word/2010/wordprocessingGroup" xmlns:wpi="http://schemas.microsoft.com/office/word/2010/wordprocessingInk" xmlns:wne="http://schemas.microsoft.com/office/word/2006/wordml" xmlns:wps="http://schemas.microsoft.com/office/word/2010/wordprocessingShape" mc:Ignorable="w14 w15 w16se w16cid w16 w16cex w16sdtdh wp14">
   <w:abstractNum w:abstractNumId="0" w15:restartNumberingAfterBreak="0">
-    <w:nsid w:val="2BDF1237"/>
+    <w:nsid w:val="B668B260"/>
     <w:multiLevelType w:val="hybridMultilevel"/>
     <w:tmpl w:val="934E79A6"/>
     <w:lvl w:ilvl="0" w:tplc="04090001">

</xml_diff>

<commit_message>
Complete integrated documentation and release validation paths
</commit_message>
<xml_diff>
--- a/Website/static/downloads/showcase/pswriteoffice/budget-forecast-review.docx
+++ b/Website/static/downloads/showcase/pswriteoffice/budget-forecast-review.docx
@@ -608,8 +608,8 @@
       </w:tr>
     </w:tbl>
     <w:sectPr>
-      <w:headerReference w:type="default" r:id="R53060477aa0d493b"/>
-      <w:footerReference w:type="default" r:id="R0049724e20b84579"/>
+      <w:headerReference w:type="default" r:id="Rdd2fec6a13d449b5"/>
+      <w:footerReference w:type="default" r:id="Ra53b2f6334064f0d"/>
       <w:pgSz w:w="12240" w:h="15840" w:code="1"/>
       <w:pgMar w:top="1440" w:right="1440" w:bottom="1440" w:left="1440" w:header="720" w:footer="720" w:gutter="0"/>
     </w:sectPr>
@@ -687,7 +687,7 @@
 <file path=word/numbering.xml><?xml version="1.0" encoding="utf-8"?>
 <w:numbering xmlns:wpc="http://schemas.microsoft.com/office/word/2010/wordprocessingCanvas" xmlns:cx="http://schemas.microsoft.com/office/drawing/2014/chartex" xmlns:cx1="http://schemas.microsoft.com/office/drawing/2015/9/8/chartex" xmlns:cx2="http://schemas.microsoft.com/office/drawing/2015/10/21/chartex" xmlns:cx3="http://schemas.microsoft.com/office/drawing/2016/5/9/chartex" xmlns:cx4="http://schemas.microsoft.com/office/drawing/2016/5/10/chartex" xmlns:cx5="http://schemas.microsoft.com/office/drawing/2016/5/11/chartex" xmlns:cx6="http://schemas.microsoft.com/office/drawing/2016/5/12/chartex" xmlns:cx7="http://schemas.microsoft.com/office/drawing/2016/5/13/chartex" xmlns:cx8="http://schemas.microsoft.com/office/drawing/2016/5/14/chartex" xmlns:mc="http://schemas.openxmlformats.org/markup-compatibility/2006" xmlns:aink="http://schemas.microsoft.com/office/drawing/2016/ink" xmlns:am3d="http://schemas.microsoft.com/office/drawing/2017/model3d" xmlns:o="urn:schemas-microsoft-com:office:office" xmlns:oel="http://schemas.microsoft.com/office/2019/extlst" xmlns:r="http://schemas.openxmlformats.org/officeDocument/2006/relationships" xmlns:m="http://schemas.openxmlformats.org/officeDocument/2006/math" xmlns:v="urn:schemas-microsoft-com:vml" xmlns:wp14="http://schemas.microsoft.com/office/word/2010/wordprocessingDrawing" xmlns:wp="http://schemas.openxmlformats.org/drawingml/2006/wordprocessingDrawing" xmlns:w10="urn:schemas-microsoft-com:office:word" xmlns:w="http://schemas.openxmlformats.org/wordprocessingml/2006/main" xmlns:w14="http://schemas.microsoft.com/office/word/2010/wordml" xmlns:w15="http://schemas.microsoft.com/office/word/2012/wordml" xmlns:w16cex="http://schemas.microsoft.com/office/word/2018/wordml/cex" xmlns:w16cid="http://schemas.microsoft.com/office/word/2016/wordml/cid" xmlns:w16="http://schemas.microsoft.com/office/word/2018/wordml" xmlns:w16sdtdh="http://schemas.microsoft.com/office/word/2020/wordml/sdtdatahash" xmlns:w16se="http://schemas.microsoft.com/office/word/2015/wordml/symex" xmlns:wpg="http://schemas.microsoft.com/office/word/2010/wordprocessingGroup" xmlns:wpi="http://schemas.microsoft.com/office/word/2010/wordprocessingInk" xmlns:wne="http://schemas.microsoft.com/office/word/2006/wordml" xmlns:wps="http://schemas.microsoft.com/office/word/2010/wordprocessingShape" mc:Ignorable="w14 w15 w16se w16cid w16 w16cex w16sdtdh wp14">
   <w:abstractNum w:abstractNumId="0" w15:restartNumberingAfterBreak="0">
-    <w:nsid w:val="B668B260"/>
+    <w:nsid w:val="63C6DC89"/>
     <w:multiLevelType w:val="hybridMultilevel"/>
     <w:tmpl w:val="934E79A6"/>
     <w:lvl w:ilvl="0" w:tplc="04090001">
@@ -801,33 +801,6 @@
   </w:abstractNum>
   <w:num w:numId="1">
     <w:abstractNumId w:val="0"/>
-    <w:lvlOverride w:ilvl="0">
-      <w:startOverride w:val="1"/>
-    </w:lvlOverride>
-    <w:lvlOverride w:ilvl="1">
-      <w:startOverride w:val="1"/>
-    </w:lvlOverride>
-    <w:lvlOverride w:ilvl="2">
-      <w:startOverride w:val="1"/>
-    </w:lvlOverride>
-    <w:lvlOverride w:ilvl="3">
-      <w:startOverride w:val="1"/>
-    </w:lvlOverride>
-    <w:lvlOverride w:ilvl="4">
-      <w:startOverride w:val="1"/>
-    </w:lvlOverride>
-    <w:lvlOverride w:ilvl="5">
-      <w:startOverride w:val="1"/>
-    </w:lvlOverride>
-    <w:lvlOverride w:ilvl="6">
-      <w:startOverride w:val="1"/>
-    </w:lvlOverride>
-    <w:lvlOverride w:ilvl="7">
-      <w:startOverride w:val="1"/>
-    </w:lvlOverride>
-    <w:lvlOverride w:ilvl="8">
-      <w:startOverride w:val="1"/>
-    </w:lvlOverride>
   </w:num>
 </w:numbering>
 </file>

</xml_diff>

<commit_message>
Refresh PSWriteOffice 3.5.2 website showcase evidence
</commit_message>
<xml_diff>
--- a/Website/static/downloads/showcase/pswriteoffice/budget-forecast-review.docx
+++ b/Website/static/downloads/showcase/pswriteoffice/budget-forecast-review.docx
@@ -608,8 +608,8 @@
       </w:tr>
     </w:tbl>
     <w:sectPr>
-      <w:headerReference w:type="default" r:id="Rdd2fec6a13d449b5"/>
-      <w:footerReference w:type="default" r:id="Ra53b2f6334064f0d"/>
+      <w:headerReference w:type="default" r:id="R910be6c7faaf4a6a"/>
+      <w:footerReference w:type="default" r:id="R56120b11eef14ea3"/>
       <w:pgSz w:w="12240" w:h="15840" w:code="1"/>
       <w:pgMar w:top="1440" w:right="1440" w:bottom="1440" w:left="1440" w:header="720" w:footer="720" w:gutter="0"/>
     </w:sectPr>
@@ -625,6 +625,7 @@
 <w:ftr xmlns:w="http://schemas.openxmlformats.org/wordprocessingml/2006/main">
   <w:p>
     <w:pPr/>
+    <w:r/>
     <w:fldSimple w:instr=" PAGE  \* MERGEFORMAT " w:dirty="true">
       <w:r>
         <w:rPr>
@@ -634,6 +635,7 @@
       </w:r>
     </w:fldSimple>
     <w:r>
+      <w:rPr/>
       <w:t xml:space="preserve"> of </w:t>
     </w:r>
     <w:fldSimple w:instr=" NUMPAGES  \* MERGEFORMAT " w:dirty="true">
@@ -687,7 +689,7 @@
 <file path=word/numbering.xml><?xml version="1.0" encoding="utf-8"?>
 <w:numbering xmlns:wpc="http://schemas.microsoft.com/office/word/2010/wordprocessingCanvas" xmlns:cx="http://schemas.microsoft.com/office/drawing/2014/chartex" xmlns:cx1="http://schemas.microsoft.com/office/drawing/2015/9/8/chartex" xmlns:cx2="http://schemas.microsoft.com/office/drawing/2015/10/21/chartex" xmlns:cx3="http://schemas.microsoft.com/office/drawing/2016/5/9/chartex" xmlns:cx4="http://schemas.microsoft.com/office/drawing/2016/5/10/chartex" xmlns:cx5="http://schemas.microsoft.com/office/drawing/2016/5/11/chartex" xmlns:cx6="http://schemas.microsoft.com/office/drawing/2016/5/12/chartex" xmlns:cx7="http://schemas.microsoft.com/office/drawing/2016/5/13/chartex" xmlns:cx8="http://schemas.microsoft.com/office/drawing/2016/5/14/chartex" xmlns:mc="http://schemas.openxmlformats.org/markup-compatibility/2006" xmlns:aink="http://schemas.microsoft.com/office/drawing/2016/ink" xmlns:am3d="http://schemas.microsoft.com/office/drawing/2017/model3d" xmlns:o="urn:schemas-microsoft-com:office:office" xmlns:oel="http://schemas.microsoft.com/office/2019/extlst" xmlns:r="http://schemas.openxmlformats.org/officeDocument/2006/relationships" xmlns:m="http://schemas.openxmlformats.org/officeDocument/2006/math" xmlns:v="urn:schemas-microsoft-com:vml" xmlns:wp14="http://schemas.microsoft.com/office/word/2010/wordprocessingDrawing" xmlns:wp="http://schemas.openxmlformats.org/drawingml/2006/wordprocessingDrawing" xmlns:w10="urn:schemas-microsoft-com:office:word" xmlns:w="http://schemas.openxmlformats.org/wordprocessingml/2006/main" xmlns:w14="http://schemas.microsoft.com/office/word/2010/wordml" xmlns:w15="http://schemas.microsoft.com/office/word/2012/wordml" xmlns:w16cex="http://schemas.microsoft.com/office/word/2018/wordml/cex" xmlns:w16cid="http://schemas.microsoft.com/office/word/2016/wordml/cid" xmlns:w16="http://schemas.microsoft.com/office/word/2018/wordml" xmlns:w16sdtdh="http://schemas.microsoft.com/office/word/2020/wordml/sdtdatahash" xmlns:w16se="http://schemas.microsoft.com/office/word/2015/wordml/symex" xmlns:wpg="http://schemas.microsoft.com/office/word/2010/wordprocessingGroup" xmlns:wpi="http://schemas.microsoft.com/office/word/2010/wordprocessingInk" xmlns:wne="http://schemas.microsoft.com/office/word/2006/wordml" xmlns:wps="http://schemas.microsoft.com/office/word/2010/wordprocessingShape" mc:Ignorable="w14 w15 w16se w16cid w16 w16cex w16sdtdh wp14">
   <w:abstractNum w:abstractNumId="0" w15:restartNumberingAfterBreak="0">
-    <w:nsid w:val="63C6DC89"/>
+    <w:nsid w:val="E4F2EC56"/>
     <w:multiLevelType w:val="hybridMultilevel"/>
     <w:tmpl w:val="934E79A6"/>
     <w:lvl w:ilvl="0" w:tplc="04090001">

</xml_diff>

<commit_message>
Refresh PSWriteOffice 3.5.2 website showcase evidence (#3182)
</commit_message>
<xml_diff>
--- a/Website/static/downloads/showcase/pswriteoffice/budget-forecast-review.docx
+++ b/Website/static/downloads/showcase/pswriteoffice/budget-forecast-review.docx
@@ -608,8 +608,8 @@
       </w:tr>
     </w:tbl>
     <w:sectPr>
-      <w:headerReference w:type="default" r:id="Rdd2fec6a13d449b5"/>
-      <w:footerReference w:type="default" r:id="Ra53b2f6334064f0d"/>
+      <w:headerReference w:type="default" r:id="R910be6c7faaf4a6a"/>
+      <w:footerReference w:type="default" r:id="R56120b11eef14ea3"/>
       <w:pgSz w:w="12240" w:h="15840" w:code="1"/>
       <w:pgMar w:top="1440" w:right="1440" w:bottom="1440" w:left="1440" w:header="720" w:footer="720" w:gutter="0"/>
     </w:sectPr>
@@ -625,6 +625,7 @@
 <w:ftr xmlns:w="http://schemas.openxmlformats.org/wordprocessingml/2006/main">
   <w:p>
     <w:pPr/>
+    <w:r/>
     <w:fldSimple w:instr=" PAGE  \* MERGEFORMAT " w:dirty="true">
       <w:r>
         <w:rPr>
@@ -634,6 +635,7 @@
       </w:r>
     </w:fldSimple>
     <w:r>
+      <w:rPr/>
       <w:t xml:space="preserve"> of </w:t>
     </w:r>
     <w:fldSimple w:instr=" NUMPAGES  \* MERGEFORMAT " w:dirty="true">
@@ -687,7 +689,7 @@
 <file path=word/numbering.xml><?xml version="1.0" encoding="utf-8"?>
 <w:numbering xmlns:wpc="http://schemas.microsoft.com/office/word/2010/wordprocessingCanvas" xmlns:cx="http://schemas.microsoft.com/office/drawing/2014/chartex" xmlns:cx1="http://schemas.microsoft.com/office/drawing/2015/9/8/chartex" xmlns:cx2="http://schemas.microsoft.com/office/drawing/2015/10/21/chartex" xmlns:cx3="http://schemas.microsoft.com/office/drawing/2016/5/9/chartex" xmlns:cx4="http://schemas.microsoft.com/office/drawing/2016/5/10/chartex" xmlns:cx5="http://schemas.microsoft.com/office/drawing/2016/5/11/chartex" xmlns:cx6="http://schemas.microsoft.com/office/drawing/2016/5/12/chartex" xmlns:cx7="http://schemas.microsoft.com/office/drawing/2016/5/13/chartex" xmlns:cx8="http://schemas.microsoft.com/office/drawing/2016/5/14/chartex" xmlns:mc="http://schemas.openxmlformats.org/markup-compatibility/2006" xmlns:aink="http://schemas.microsoft.com/office/drawing/2016/ink" xmlns:am3d="http://schemas.microsoft.com/office/drawing/2017/model3d" xmlns:o="urn:schemas-microsoft-com:office:office" xmlns:oel="http://schemas.microsoft.com/office/2019/extlst" xmlns:r="http://schemas.openxmlformats.org/officeDocument/2006/relationships" xmlns:m="http://schemas.openxmlformats.org/officeDocument/2006/math" xmlns:v="urn:schemas-microsoft-com:vml" xmlns:wp14="http://schemas.microsoft.com/office/word/2010/wordprocessingDrawing" xmlns:wp="http://schemas.openxmlformats.org/drawingml/2006/wordprocessingDrawing" xmlns:w10="urn:schemas-microsoft-com:office:word" xmlns:w="http://schemas.openxmlformats.org/wordprocessingml/2006/main" xmlns:w14="http://schemas.microsoft.com/office/word/2010/wordml" xmlns:w15="http://schemas.microsoft.com/office/word/2012/wordml" xmlns:w16cex="http://schemas.microsoft.com/office/word/2018/wordml/cex" xmlns:w16cid="http://schemas.microsoft.com/office/word/2016/wordml/cid" xmlns:w16="http://schemas.microsoft.com/office/word/2018/wordml" xmlns:w16sdtdh="http://schemas.microsoft.com/office/word/2020/wordml/sdtdatahash" xmlns:w16se="http://schemas.microsoft.com/office/word/2015/wordml/symex" xmlns:wpg="http://schemas.microsoft.com/office/word/2010/wordprocessingGroup" xmlns:wpi="http://schemas.microsoft.com/office/word/2010/wordprocessingInk" xmlns:wne="http://schemas.microsoft.com/office/word/2006/wordml" xmlns:wps="http://schemas.microsoft.com/office/word/2010/wordprocessingShape" mc:Ignorable="w14 w15 w16se w16cid w16 w16cex w16sdtdh wp14">
   <w:abstractNum w:abstractNumId="0" w15:restartNumberingAfterBreak="0">
-    <w:nsid w:val="63C6DC89"/>
+    <w:nsid w:val="E4F2EC56"/>
     <w:multiLevelType w:val="hybridMultilevel"/>
     <w:tmpl w:val="934E79A6"/>
     <w:lvl w:ilvl="0" w:tplc="04090001">

</xml_diff>

<commit_message>
Refresh the website examples and their generation evidence
</commit_message>
<xml_diff>
--- a/Website/static/downloads/showcase/pswriteoffice/budget-forecast-review.docx
+++ b/Website/static/downloads/showcase/pswriteoffice/budget-forecast-review.docx
@@ -9,8 +9,8 @@
       </w:pPr>
       <w:r>
         <w:rPr>
-          <w:b/>
-          <w:bCs/>
+          <w:b w:val="true"/>
+          <w:bCs w:val="true"/>
           <w:color w:val="17365D"/>
           <w:sz w:val="50"/>
         </w:rPr>
@@ -97,7 +97,7 @@
       <w:tr>
         <w:trPr>
           <w:cantSplit/>
-          <w:tblHeader/>
+          <w:tblHeader w:val="on"/>
         </w:trPr>
         <w:tc>
           <w:tcPr>
@@ -608,8 +608,8 @@
       </w:tr>
     </w:tbl>
     <w:sectPr>
-      <w:headerReference w:type="default" r:id="R910be6c7faaf4a6a"/>
-      <w:footerReference w:type="default" r:id="R56120b11eef14ea3"/>
+      <w:headerReference w:type="default" r:id="R8563f3a57a904864"/>
+      <w:footerReference w:type="default" r:id="R83bbcab14e914873"/>
       <w:pgSz w:w="12240" w:h="15840" w:code="1"/>
       <w:pgMar w:top="1440" w:right="1440" w:bottom="1440" w:left="1440" w:header="720" w:footer="720" w:gutter="0"/>
     </w:sectPr>
@@ -689,7 +689,7 @@
 <file path=word/numbering.xml><?xml version="1.0" encoding="utf-8"?>
 <w:numbering xmlns:wpc="http://schemas.microsoft.com/office/word/2010/wordprocessingCanvas" xmlns:cx="http://schemas.microsoft.com/office/drawing/2014/chartex" xmlns:cx1="http://schemas.microsoft.com/office/drawing/2015/9/8/chartex" xmlns:cx2="http://schemas.microsoft.com/office/drawing/2015/10/21/chartex" xmlns:cx3="http://schemas.microsoft.com/office/drawing/2016/5/9/chartex" xmlns:cx4="http://schemas.microsoft.com/office/drawing/2016/5/10/chartex" xmlns:cx5="http://schemas.microsoft.com/office/drawing/2016/5/11/chartex" xmlns:cx6="http://schemas.microsoft.com/office/drawing/2016/5/12/chartex" xmlns:cx7="http://schemas.microsoft.com/office/drawing/2016/5/13/chartex" xmlns:cx8="http://schemas.microsoft.com/office/drawing/2016/5/14/chartex" xmlns:mc="http://schemas.openxmlformats.org/markup-compatibility/2006" xmlns:aink="http://schemas.microsoft.com/office/drawing/2016/ink" xmlns:am3d="http://schemas.microsoft.com/office/drawing/2017/model3d" xmlns:o="urn:schemas-microsoft-com:office:office" xmlns:oel="http://schemas.microsoft.com/office/2019/extlst" xmlns:r="http://schemas.openxmlformats.org/officeDocument/2006/relationships" xmlns:m="http://schemas.openxmlformats.org/officeDocument/2006/math" xmlns:v="urn:schemas-microsoft-com:vml" xmlns:wp14="http://schemas.microsoft.com/office/word/2010/wordprocessingDrawing" xmlns:wp="http://schemas.openxmlformats.org/drawingml/2006/wordprocessingDrawing" xmlns:w10="urn:schemas-microsoft-com:office:word" xmlns:w="http://schemas.openxmlformats.org/wordprocessingml/2006/main" xmlns:w14="http://schemas.microsoft.com/office/word/2010/wordml" xmlns:w15="http://schemas.microsoft.com/office/word/2012/wordml" xmlns:w16cex="http://schemas.microsoft.com/office/word/2018/wordml/cex" xmlns:w16cid="http://schemas.microsoft.com/office/word/2016/wordml/cid" xmlns:w16="http://schemas.microsoft.com/office/word/2018/wordml" xmlns:w16sdtdh="http://schemas.microsoft.com/office/word/2020/wordml/sdtdatahash" xmlns:w16se="http://schemas.microsoft.com/office/word/2015/wordml/symex" xmlns:wpg="http://schemas.microsoft.com/office/word/2010/wordprocessingGroup" xmlns:wpi="http://schemas.microsoft.com/office/word/2010/wordprocessingInk" xmlns:wne="http://schemas.microsoft.com/office/word/2006/wordml" xmlns:wps="http://schemas.microsoft.com/office/word/2010/wordprocessingShape" mc:Ignorable="w14 w15 w16se w16cid w16 w16cex w16sdtdh wp14">
   <w:abstractNum w:abstractNumId="0" w15:restartNumberingAfterBreak="0">
-    <w:nsid w:val="E4F2EC56"/>
+    <w:nsid w:val="46661C9A"/>
     <w:multiLevelType w:val="hybridMultilevel"/>
     <w:tmpl w:val="934E79A6"/>
     <w:lvl w:ilvl="0" w:tplc="04090001">
@@ -812,7 +812,8 @@
   <w:docDefaults>
     <w:rPrDefault>
       <w:rPr>
-        <w:rFonts w:asciiTheme="minorHAnsi" w:hAnsiTheme="minorHAnsi" w:eastAsiaTheme="minorHAnsi" w:cstheme="minorBidi"/>
+        <w:rFonts w:ascii="Aptos" w:hAnsi="Aptos" w:eastAsia="Aptos" w:cs="Aptos"/>
+        <w:color w:val="1B2433"/>
         <w:sz w:val="22"/>
         <w:szCs w:val="22"/>
         <w:lang w:val="en-US" w:eastAsia="en-US" w:bidi="ar-SA"/>
@@ -10745,18 +10746,19 @@
     <w:link w:val="Heading1Char"/>
     <w:uiPriority w:val="9"/>
     <w:qFormat/>
-    <w:rsid w:val="00973C6F"/>
     <w:pPr>
       <w:keepNext/>
       <w:keepLines/>
-      <w:spacing w:before="240" w:after="0"/>
+      <w:spacing w:before="360" w:after="120"/>
       <w:outlineLvl w:val="0"/>
     </w:pPr>
     <w:rPr>
-      <w:rFonts w:asciiTheme="majorHAnsi" w:hAnsiTheme="majorHAnsi" w:eastAsiaTheme="majorEastAsia" w:cstheme="majorBidi"/>
-      <w:color w:val="2F5496" w:themeColor="accent1" w:themeShade="BF"/>
-      <w:sz w:val="32"/>
-      <w:szCs w:val="32"/>
+      <w:rFonts w:asciiTheme="minorHAnsi" w:hAnsiTheme="minorHAnsi" w:eastAsiaTheme="minorEastAsia" w:cstheme="minorBidi"/>
+      <w:b/>
+      <w:bCs/>
+      <w:color w:val="1B2433"/>
+      <w:sz w:val="40"/>
+      <w:szCs w:val="40"/>
     </w:rPr>
   </w:style>
   <w:style w:type="paragraph" w:styleId="Heading2">
@@ -10766,19 +10768,19 @@
     <w:link w:val="Heading2Char"/>
     <w:uiPriority w:val="9"/>
     <w:unhideWhenUsed/>
-    <w:qFormat/>
-    <w:rsid w:val="00973C6F"/>
     <w:pPr>
       <w:keepNext/>
       <w:keepLines/>
-      <w:spacing w:before="40" w:after="0"/>
+      <w:spacing w:before="280" w:after="80"/>
       <w:outlineLvl w:val="1"/>
     </w:pPr>
     <w:rPr>
-      <w:rFonts w:asciiTheme="majorHAnsi" w:hAnsiTheme="majorHAnsi" w:eastAsiaTheme="majorEastAsia" w:cstheme="majorBidi"/>
-      <w:color w:val="2F5496" w:themeColor="accent1" w:themeShade="BF"/>
-      <w:sz w:val="26"/>
-      <w:szCs w:val="26"/>
+      <w:rFonts w:asciiTheme="minorHAnsi" w:hAnsiTheme="minorHAnsi" w:eastAsiaTheme="minorEastAsia" w:cstheme="minorBidi"/>
+      <w:b/>
+      <w:bCs/>
+      <w:color w:val="1B2433"/>
+      <w:sz w:val="30"/>
+      <w:szCs w:val="30"/>
     </w:rPr>
   </w:style>
   <w:style w:type="paragraph" w:styleId="Heading3">
@@ -10787,21 +10789,20 @@
     <w:next w:val="Normal"/>
     <w:link w:val="Heading3Char"/>
     <w:uiPriority w:val="9"/>
-    <w:semiHidden/>
     <w:unhideWhenUsed/>
-    <w:qFormat/>
-    <w:rsid w:val="00700ED2"/>
     <w:pPr>
       <w:keepNext/>
       <w:keepLines/>
-      <w:spacing w:before="40" w:after="0"/>
+      <w:spacing w:before="240" w:after="60"/>
       <w:outlineLvl w:val="2"/>
     </w:pPr>
     <w:rPr>
-      <w:rFonts w:asciiTheme="majorHAnsi" w:hAnsiTheme="majorHAnsi" w:eastAsiaTheme="majorEastAsia" w:cstheme="majorBidi"/>
-      <w:color w:val="1F3763" w:themeColor="accent1" w:themeShade="7F"/>
-      <w:sz w:val="24"/>
-      <w:szCs w:val="24"/>
+      <w:rFonts w:asciiTheme="minorHAnsi" w:hAnsiTheme="minorHAnsi" w:eastAsiaTheme="minorEastAsia" w:cstheme="minorBidi"/>
+      <w:b/>
+      <w:bCs/>
+      <w:color w:val="1B2433"/>
+      <w:sz w:val="25"/>
+      <w:szCs w:val="25"/>
     </w:rPr>
   </w:style>
   <w:style w:type="paragraph" w:styleId="Heading4">
@@ -10810,21 +10811,20 @@
     <w:next w:val="Normal"/>
     <w:link w:val="Heading4Char"/>
     <w:uiPriority w:val="9"/>
-    <w:semiHidden/>
     <w:unhideWhenUsed/>
-    <w:qFormat/>
-    <w:rsid w:val="00700ED2"/>
     <w:pPr>
       <w:keepNext/>
       <w:keepLines/>
-      <w:spacing w:before="40" w:after="0"/>
+      <w:spacing w:before="240" w:after="60"/>
       <w:outlineLvl w:val="3"/>
     </w:pPr>
     <w:rPr>
-      <w:rFonts w:asciiTheme="majorHAnsi" w:hAnsiTheme="majorHAnsi" w:eastAsiaTheme="majorEastAsia" w:cstheme="majorBidi"/>
-      <w:i/>
-      <w:iCs/>
-      <w:color w:val="2F5496" w:themeColor="accent1" w:themeShade="BF"/>
+      <w:rFonts w:asciiTheme="minorHAnsi" w:hAnsiTheme="minorHAnsi" w:eastAsiaTheme="minorEastAsia" w:cstheme="minorBidi"/>
+      <w:b/>
+      <w:bCs/>
+      <w:color w:val="1B2433"/>
+      <w:sz w:val="22"/>
+      <w:szCs w:val="22"/>
     </w:rPr>
   </w:style>
   <w:style w:type="paragraph" w:styleId="Heading5">
@@ -10833,19 +10833,20 @@
     <w:next w:val="Normal"/>
     <w:link w:val="Heading5Char"/>
     <w:uiPriority w:val="9"/>
-    <w:semiHidden/>
     <w:unhideWhenUsed/>
-    <w:qFormat/>
-    <w:rsid w:val="00700ED2"/>
     <w:pPr>
       <w:keepNext/>
       <w:keepLines/>
-      <w:spacing w:before="40" w:after="0"/>
+      <w:spacing w:before="240" w:after="60"/>
       <w:outlineLvl w:val="4"/>
     </w:pPr>
     <w:rPr>
-      <w:rFonts w:asciiTheme="majorHAnsi" w:hAnsiTheme="majorHAnsi" w:eastAsiaTheme="majorEastAsia" w:cstheme="majorBidi"/>
-      <w:color w:val="2F5496" w:themeColor="accent1" w:themeShade="BF"/>
+      <w:rFonts w:asciiTheme="minorHAnsi" w:hAnsiTheme="minorHAnsi" w:eastAsiaTheme="minorEastAsia" w:cstheme="minorBidi"/>
+      <w:b/>
+      <w:bCs/>
+      <w:color w:val="1B2433"/>
+      <w:sz w:val="22"/>
+      <w:szCs w:val="22"/>
     </w:rPr>
   </w:style>
   <w:style w:type="paragraph" w:styleId="Heading6">
@@ -10854,19 +10855,20 @@
     <w:next w:val="Normal"/>
     <w:link w:val="Heading6Char"/>
     <w:uiPriority w:val="9"/>
-    <w:semiHidden/>
     <w:unhideWhenUsed/>
-    <w:qFormat/>
-    <w:rsid w:val="00700ED2"/>
     <w:pPr>
       <w:keepNext/>
       <w:keepLines/>
-      <w:spacing w:before="40" w:after="0"/>
+      <w:spacing w:before="240" w:after="60"/>
       <w:outlineLvl w:val="5"/>
     </w:pPr>
     <w:rPr>
-      <w:rFonts w:asciiTheme="majorHAnsi" w:hAnsiTheme="majorHAnsi" w:eastAsiaTheme="majorEastAsia" w:cstheme="majorBidi"/>
-      <w:color w:val="1F3763" w:themeColor="accent1" w:themeShade="7F"/>
+      <w:rFonts w:asciiTheme="minorHAnsi" w:hAnsiTheme="minorHAnsi" w:eastAsiaTheme="minorEastAsia" w:cstheme="minorBidi"/>
+      <w:b/>
+      <w:bCs/>
+      <w:color w:val="1B2433"/>
+      <w:sz w:val="20"/>
+      <w:szCs w:val="20"/>
     </w:rPr>
   </w:style>
   <w:style w:type="paragraph" w:styleId="Heading7">
@@ -10951,6 +10953,43 @@
       <w:contextualSpacing/>
     </w:pPr>
   </w:style>
+  <w:style w:type="paragraph" w:styleId="Title">
+    <w:name w:val="Title"/>
+    <w:basedOn w:val="Normal"/>
+    <w:next w:val="Normal"/>
+    <w:uiPriority w:val="10"/>
+    <w:qFormat/>
+    <w:pPr>
+      <w:keepNext/>
+      <w:spacing w:before="0" w:after="120" w:line="240" w:lineRule="auto"/>
+      <w:contextualSpacing/>
+    </w:pPr>
+    <w:rPr>
+      <w:rFonts w:asciiTheme="minorHAnsi" w:hAnsiTheme="minorHAnsi" w:eastAsiaTheme="minorEastAsia" w:cstheme="minorBidi"/>
+      <w:b/>
+      <w:bCs/>
+      <w:color w:val="1B2433"/>
+      <w:kern w:val="28"/>
+      <w:sz w:val="56"/>
+      <w:szCs w:val="56"/>
+    </w:rPr>
+  </w:style>
+  <w:style w:type="paragraph" w:styleId="Subtitle">
+    <w:name w:val="Subtitle"/>
+    <w:basedOn w:val="Normal"/>
+    <w:next w:val="Normal"/>
+    <w:uiPriority w:val="11"/>
+    <w:qFormat/>
+    <w:pPr>
+      <w:keepNext/>
+      <w:spacing w:before="0" w:after="240"/>
+    </w:pPr>
+    <w:rPr>
+      <w:color w:val="3F64D7"/>
+      <w:sz w:val="25"/>
+      <w:szCs w:val="25"/>
+    </w:rPr>
+  </w:style>
   <w:style w:type="character" w:styleId="DefaultParagraphFont" w:default="true">
     <w:name w:val="Default Paragraph Font"/>
     <w:uiPriority w:val="1"/>
@@ -10962,12 +11001,15 @@
     <w:basedOn w:val="DefaultParagraphFont"/>
     <w:link w:val="Heading1"/>
     <w:uiPriority w:val="9"/>
-    <w:rsid w:val="00700ED2"/>
+    <w:semiHidden/>
+    <w:unhideWhenUsed/>
     <w:rPr>
-      <w:rFonts w:asciiTheme="majorHAnsi" w:hAnsiTheme="majorHAnsi" w:eastAsiaTheme="majorEastAsia" w:cstheme="majorBidi"/>
-      <w:color w:val="2F5496" w:themeColor="accent1" w:themeShade="BF"/>
-      <w:sz w:val="32"/>
-      <w:szCs w:val="32"/>
+      <w:rFonts w:asciiTheme="minorHAnsi" w:hAnsiTheme="minorHAnsi" w:eastAsiaTheme="minorEastAsia" w:cstheme="minorBidi"/>
+      <w:b/>
+      <w:bCs/>
+      <w:color w:val="1B2433"/>
+      <w:sz w:val="40"/>
+      <w:szCs w:val="40"/>
     </w:rPr>
   </w:style>
   <w:style w:type="character" w:styleId="Heading2Char" w:customStyle="true">
@@ -10976,12 +11018,14 @@
     <w:link w:val="Heading2"/>
     <w:uiPriority w:val="9"/>
     <w:semiHidden/>
-    <w:rsid w:val="00700ED2"/>
+    <w:unhideWhenUsed/>
     <w:rPr>
-      <w:rFonts w:asciiTheme="majorHAnsi" w:hAnsiTheme="majorHAnsi" w:eastAsiaTheme="majorEastAsia" w:cstheme="majorBidi"/>
-      <w:color w:val="2F5496" w:themeColor="accent1" w:themeShade="BF"/>
-      <w:sz w:val="26"/>
-      <w:szCs w:val="26"/>
+      <w:rFonts w:asciiTheme="minorHAnsi" w:hAnsiTheme="minorHAnsi" w:eastAsiaTheme="minorEastAsia" w:cstheme="minorBidi"/>
+      <w:b/>
+      <w:bCs/>
+      <w:color w:val="1B2433"/>
+      <w:sz w:val="30"/>
+      <w:szCs w:val="30"/>
     </w:rPr>
   </w:style>
   <w:style w:type="character" w:styleId="Heading3Char" w:customStyle="true">
@@ -10990,12 +11034,14 @@
     <w:link w:val="Heading3"/>
     <w:uiPriority w:val="9"/>
     <w:semiHidden/>
-    <w:rsid w:val="00700ED2"/>
+    <w:unhideWhenUsed/>
     <w:rPr>
-      <w:rFonts w:asciiTheme="majorHAnsi" w:hAnsiTheme="majorHAnsi" w:eastAsiaTheme="majorEastAsia" w:cstheme="majorBidi"/>
-      <w:color w:val="1F3763" w:themeColor="accent1" w:themeShade="7F"/>
-      <w:sz w:val="24"/>
-      <w:szCs w:val="24"/>
+      <w:rFonts w:asciiTheme="minorHAnsi" w:hAnsiTheme="minorHAnsi" w:eastAsiaTheme="minorEastAsia" w:cstheme="minorBidi"/>
+      <w:b/>
+      <w:bCs/>
+      <w:color w:val="1B2433"/>
+      <w:sz w:val="25"/>
+      <w:szCs w:val="25"/>
     </w:rPr>
   </w:style>
   <w:style w:type="character" w:styleId="Heading4Char" w:customStyle="true">
@@ -11004,12 +11050,14 @@
     <w:link w:val="Heading4"/>
     <w:uiPriority w:val="9"/>
     <w:semiHidden/>
-    <w:rsid w:val="00700ED2"/>
+    <w:unhideWhenUsed/>
     <w:rPr>
-      <w:rFonts w:asciiTheme="majorHAnsi" w:hAnsiTheme="majorHAnsi" w:eastAsiaTheme="majorEastAsia" w:cstheme="majorBidi"/>
-      <w:i/>
-      <w:iCs/>
-      <w:color w:val="2F5496" w:themeColor="accent1" w:themeShade="BF"/>
+      <w:rFonts w:asciiTheme="minorHAnsi" w:hAnsiTheme="minorHAnsi" w:eastAsiaTheme="minorEastAsia" w:cstheme="minorBidi"/>
+      <w:b/>
+      <w:bCs/>
+      <w:color w:val="1B2433"/>
+      <w:sz w:val="22"/>
+      <w:szCs w:val="22"/>
     </w:rPr>
   </w:style>
   <w:style w:type="character" w:styleId="Heading5Char" w:customStyle="true">
@@ -11018,10 +11066,14 @@
     <w:link w:val="Heading5"/>
     <w:uiPriority w:val="9"/>
     <w:semiHidden/>
-    <w:rsid w:val="00700ED2"/>
+    <w:unhideWhenUsed/>
     <w:rPr>
-      <w:rFonts w:asciiTheme="majorHAnsi" w:hAnsiTheme="majorHAnsi" w:eastAsiaTheme="majorEastAsia" w:cstheme="majorBidi"/>
-      <w:color w:val="2F5496" w:themeColor="accent1" w:themeShade="BF"/>
+      <w:rFonts w:asciiTheme="minorHAnsi" w:hAnsiTheme="minorHAnsi" w:eastAsiaTheme="minorEastAsia" w:cstheme="minorBidi"/>
+      <w:b/>
+      <w:bCs/>
+      <w:color w:val="1B2433"/>
+      <w:sz w:val="22"/>
+      <w:szCs w:val="22"/>
     </w:rPr>
   </w:style>
   <w:style w:type="character" w:styleId="Heading6Char" w:customStyle="true">
@@ -11030,10 +11082,14 @@
     <w:link w:val="Heading6"/>
     <w:uiPriority w:val="9"/>
     <w:semiHidden/>
-    <w:rsid w:val="00700ED2"/>
+    <w:unhideWhenUsed/>
     <w:rPr>
-      <w:rFonts w:asciiTheme="majorHAnsi" w:hAnsiTheme="majorHAnsi" w:eastAsiaTheme="majorEastAsia" w:cstheme="majorBidi"/>
-      <w:color w:val="1F3763" w:themeColor="accent1" w:themeShade="7F"/>
+      <w:rFonts w:asciiTheme="minorHAnsi" w:hAnsiTheme="minorHAnsi" w:eastAsiaTheme="minorEastAsia" w:cstheme="minorBidi"/>
+      <w:b/>
+      <w:bCs/>
+      <w:color w:val="1B2433"/>
+      <w:sz w:val="20"/>
+      <w:szCs w:val="20"/>
     </w:rPr>
   </w:style>
   <w:style w:type="character" w:styleId="Heading7Char" w:customStyle="true">
@@ -11208,55 +11264,252 @@
       <w:vertAlign w:val="superscript"/>
     </w:rPr>
   </w:style>
+  <w:style w:type="paragraph" w:styleId="TOCHeading">
+    <w:name w:val="TOC Heading"/>
+    <w:basedOn w:val="Heading1"/>
+    <w:next w:val="Normal"/>
+    <w:uiPriority w:val="39"/>
+    <w:unhideWhenUsed/>
+    <w:qFormat/>
+    <w:pPr>
+      <w:outlineLvl w:val="9"/>
+    </w:pPr>
+  </w:style>
+  <w:style w:type="paragraph" w:styleId="TOC1">
+    <w:name w:val="toc 1"/>
+    <w:basedOn w:val="Normal"/>
+    <w:next w:val="Normal"/>
+    <w:autoRedefine/>
+    <w:uiPriority w:val="39"/>
+    <w:unhideWhenUsed/>
+    <w:pPr>
+      <w:tabs>
+        <w:tab w:val="right" w:leader="dot" w:pos="9350"/>
+      </w:tabs>
+      <w:spacing w:after="100"/>
+    </w:pPr>
+  </w:style>
+  <w:style w:type="paragraph" w:styleId="TOC2">
+    <w:name w:val="toc 2"/>
+    <w:basedOn w:val="Normal"/>
+    <w:next w:val="Normal"/>
+    <w:autoRedefine/>
+    <w:uiPriority w:val="39"/>
+    <w:unhideWhenUsed/>
+    <w:pPr>
+      <w:tabs>
+        <w:tab w:val="right" w:leader="dot" w:pos="9350"/>
+      </w:tabs>
+      <w:spacing w:after="100"/>
+      <w:ind w:left="220"/>
+    </w:pPr>
+  </w:style>
+  <w:style w:type="paragraph" w:styleId="TOC3">
+    <w:name w:val="toc 3"/>
+    <w:basedOn w:val="Normal"/>
+    <w:next w:val="Normal"/>
+    <w:autoRedefine/>
+    <w:uiPriority w:val="39"/>
+    <w:unhideWhenUsed/>
+    <w:pPr>
+      <w:tabs>
+        <w:tab w:val="right" w:leader="dot" w:pos="9350"/>
+      </w:tabs>
+      <w:spacing w:after="100"/>
+      <w:ind w:left="440"/>
+    </w:pPr>
+  </w:style>
+  <w:style w:type="paragraph" w:styleId="TOC4">
+    <w:name w:val="toc 4"/>
+    <w:basedOn w:val="Normal"/>
+    <w:next w:val="Normal"/>
+    <w:autoRedefine/>
+    <w:uiPriority w:val="39"/>
+    <w:unhideWhenUsed/>
+    <w:pPr>
+      <w:tabs>
+        <w:tab w:val="right" w:leader="dot" w:pos="9350"/>
+      </w:tabs>
+      <w:spacing w:after="100"/>
+      <w:ind w:left="660"/>
+    </w:pPr>
+  </w:style>
+  <w:style w:type="paragraph" w:styleId="TOC5">
+    <w:name w:val="toc 5"/>
+    <w:basedOn w:val="Normal"/>
+    <w:next w:val="Normal"/>
+    <w:autoRedefine/>
+    <w:uiPriority w:val="39"/>
+    <w:unhideWhenUsed/>
+    <w:pPr>
+      <w:tabs>
+        <w:tab w:val="right" w:leader="dot" w:pos="9350"/>
+      </w:tabs>
+      <w:spacing w:after="100"/>
+      <w:ind w:left="880"/>
+    </w:pPr>
+  </w:style>
+  <w:style w:type="paragraph" w:styleId="TOC6">
+    <w:name w:val="toc 6"/>
+    <w:basedOn w:val="Normal"/>
+    <w:next w:val="Normal"/>
+    <w:autoRedefine/>
+    <w:uiPriority w:val="39"/>
+    <w:unhideWhenUsed/>
+    <w:pPr>
+      <w:tabs>
+        <w:tab w:val="right" w:leader="dot" w:pos="9350"/>
+      </w:tabs>
+      <w:spacing w:after="100"/>
+      <w:ind w:left="1100"/>
+    </w:pPr>
+  </w:style>
+  <w:style w:type="paragraph" w:styleId="TOC7">
+    <w:name w:val="toc 7"/>
+    <w:basedOn w:val="Normal"/>
+    <w:next w:val="Normal"/>
+    <w:autoRedefine/>
+    <w:uiPriority w:val="39"/>
+    <w:unhideWhenUsed/>
+    <w:pPr>
+      <w:tabs>
+        <w:tab w:val="right" w:leader="dot" w:pos="9350"/>
+      </w:tabs>
+      <w:spacing w:after="100"/>
+      <w:ind w:left="1320"/>
+    </w:pPr>
+  </w:style>
+  <w:style w:type="paragraph" w:styleId="TOC8">
+    <w:name w:val="toc 8"/>
+    <w:basedOn w:val="Normal"/>
+    <w:next w:val="Normal"/>
+    <w:autoRedefine/>
+    <w:uiPriority w:val="39"/>
+    <w:unhideWhenUsed/>
+    <w:pPr>
+      <w:tabs>
+        <w:tab w:val="right" w:leader="dot" w:pos="9350"/>
+      </w:tabs>
+      <w:spacing w:after="100"/>
+      <w:ind w:left="1540"/>
+    </w:pPr>
+  </w:style>
+  <w:style w:type="paragraph" w:styleId="TOC9">
+    <w:name w:val="toc 9"/>
+    <w:basedOn w:val="Normal"/>
+    <w:next w:val="Normal"/>
+    <w:autoRedefine/>
+    <w:uiPriority w:val="39"/>
+    <w:unhideWhenUsed/>
+    <w:pPr>
+      <w:tabs>
+        <w:tab w:val="right" w:leader="dot" w:pos="9350"/>
+      </w:tabs>
+      <w:spacing w:after="100"/>
+      <w:ind w:left="1760"/>
+    </w:pPr>
+  </w:style>
+  <w:style w:type="table" w:styleId="OfficeIMOModern">
+    <w:name w:val="OfficeIMO Modern"/>
+    <w:basedOn w:val="TableNormal"/>
+    <w:uiPriority w:val="40"/>
+    <w:pPr>
+      <w:spacing w:before="0" w:after="0" w:line="240" w:lineRule="auto"/>
+    </w:pPr>
+    <w:rPr>
+      <w:rFonts w:ascii="Aptos" w:hAnsi="Aptos" w:eastAsia="Aptos" w:cs="Aptos"/>
+      <w:color w:val="1B2433"/>
+      <w:sz w:val="20"/>
+      <w:szCs w:val="20"/>
+    </w:rPr>
+    <w:tblPr>
+      <w:tblStyleRowBandSize w:val="1"/>
+      <w:tblStyleColBandSize w:val="1"/>
+      <w:tblBorders>
+        <w:bottom w:val="single" w:color="DCE2EA" w:sz="4" w:space="0"/>
+        <w:insideH w:val="single" w:color="DCE2EA" w:sz="4" w:space="0"/>
+      </w:tblBorders>
+      <w:tblCellMar>
+        <w:top w:w="100" w:type="dxa"/>
+        <w:left w:w="140" w:type="dxa"/>
+        <w:bottom w:w="100" w:type="dxa"/>
+        <w:right w:w="140" w:type="dxa"/>
+      </w:tblCellMar>
+    </w:tblPr>
+    <w:tblStylePr w:type="firstRow">
+      <w:pPr>
+        <w:keepNext/>
+      </w:pPr>
+      <w:rPr>
+        <w:b w:val="true"/>
+        <w:bCs w:val="true"/>
+        <w:color w:val="1B2433"/>
+      </w:rPr>
+      <w:trPr>
+        <w:tblHeader/>
+      </w:trPr>
+      <w:tcPr>
+        <w:tcBorders>
+          <w:bottom w:val="single" w:color="3F64D7" w:sz="8" w:space="0"/>
+        </w:tcBorders>
+        <w:shd w:val="clear" w:color="auto" w:fill="EAF0FC"/>
+      </w:tcPr>
+    </w:tblStylePr>
+    <w:tblStylePr w:type="band2Horz">
+      <w:tcPr>
+        <w:shd w:val="clear" w:color="auto" w:fill="F6F8FB"/>
+      </w:tcPr>
+    </w:tblStylePr>
+  </w:style>
 </w:styles>
 </file>
 
 <file path=word/theme/theme1.xml><?xml version="1.0" encoding="utf-8"?>
-<a:theme xmlns:thm15="http://schemas.microsoft.com/office/thememl/2012/main" xmlns:a="http://schemas.openxmlformats.org/drawingml/2006/main" name="Office Theme">
+<a:theme xmlns:thm15="http://schemas.microsoft.com/office/thememl/2012/main" xmlns:a="http://schemas.openxmlformats.org/drawingml/2006/main" name="Modern">
   <a:themeElements>
-    <a:clrScheme name="Office">
+    <a:clrScheme name="Modern">
       <a:dk1>
-        <a:sysClr val="windowText" lastClr="000000"/>
+        <a:srgbClr val="1B2433"/>
       </a:dk1>
       <a:lt1>
-        <a:sysClr val="window" lastClr="FFFFFF"/>
+        <a:srgbClr val="FFFFFF"/>
       </a:lt1>
       <a:dk2>
-        <a:srgbClr val="44546A"/>
+        <a:srgbClr val="5B6575"/>
       </a:dk2>
       <a:lt2>
-        <a:srgbClr val="E7E6E6"/>
+        <a:srgbClr val="F6F8FB"/>
       </a:lt2>
       <a:accent1>
-        <a:srgbClr val="4472C4"/>
+        <a:srgbClr val="3F64D7"/>
       </a:accent1>
       <a:accent2>
-        <a:srgbClr val="ED7D31"/>
+        <a:srgbClr val="DC7536"/>
       </a:accent2>
       <a:accent3>
-        <a:srgbClr val="A5A5A5"/>
+        <a:srgbClr val="058E80"/>
       </a:accent3>
       <a:accent4>
-        <a:srgbClr val="FFC000"/>
+        <a:srgbClr val="A52758"/>
       </a:accent4>
       <a:accent5>
-        <a:srgbClr val="5B9BD5"/>
+        <a:srgbClr val="3F2F6B"/>
       </a:accent5>
       <a:accent6>
-        <a:srgbClr val="70AD47"/>
+        <a:srgbClr val="255319"/>
       </a:accent6>
       <a:hlink>
-        <a:srgbClr val="0563C1"/>
+        <a:srgbClr val="3F64D7"/>
       </a:hlink>
       <a:folHlink>
-        <a:srgbClr val="954F72"/>
+        <a:srgbClr val="DC7536"/>
       </a:folHlink>
     </a:clrScheme>
-    <a:fontScheme name="Office">
+    <a:fontScheme name="Modern">
       <a:majorFont>
-        <a:latin typeface="Calibri Light" panose="020F0302020204030204"/>
-        <a:ea typeface=""/>
-        <a:cs typeface=""/>
+        <a:latin typeface="Aptos"/>
+        <a:ea typeface="Aptos"/>
+        <a:cs typeface="Aptos"/>
         <a:font script="Jpan" typeface="游ゴシック Light"/>
         <a:font script="Hang" typeface="맑은 고딕"/>
         <a:font script="Hans" typeface="等线 Light"/>
@@ -11306,9 +11559,9 @@
         <a:font script="Tfng" typeface="Ebrima"/>
       </a:majorFont>
       <a:minorFont>
-        <a:latin typeface="Calibri" panose="020F0502020204030204"/>
-        <a:ea typeface=""/>
-        <a:cs typeface=""/>
+        <a:latin typeface="Aptos"/>
+        <a:ea typeface="Aptos"/>
+        <a:cs typeface="Aptos"/>
         <a:font script="Jpan" typeface="游明朝"/>
         <a:font script="Hang" typeface="맑은 고딕"/>
         <a:font script="Hans" typeface="等线"/>

</xml_diff>

<commit_message>
Refresh Word text help and executable examples
</commit_message>
<xml_diff>
--- a/Website/static/downloads/showcase/pswriteoffice/budget-forecast-review.docx
+++ b/Website/static/downloads/showcase/pswriteoffice/budget-forecast-review.docx
@@ -608,8 +608,8 @@
       </w:tr>
     </w:tbl>
     <w:sectPr>
-      <w:headerReference w:type="default" r:id="R8563f3a57a904864"/>
-      <w:footerReference w:type="default" r:id="R83bbcab14e914873"/>
+      <w:headerReference w:type="default" r:id="R4da9e0480f9c4774"/>
+      <w:footerReference w:type="default" r:id="R8492ad7e35e04d77"/>
       <w:pgSz w:w="12240" w:h="15840" w:code="1"/>
       <w:pgMar w:top="1440" w:right="1440" w:bottom="1440" w:left="1440" w:header="720" w:footer="720" w:gutter="0"/>
     </w:sectPr>
@@ -689,7 +689,7 @@
 <file path=word/numbering.xml><?xml version="1.0" encoding="utf-8"?>
 <w:numbering xmlns:wpc="http://schemas.microsoft.com/office/word/2010/wordprocessingCanvas" xmlns:cx="http://schemas.microsoft.com/office/drawing/2014/chartex" xmlns:cx1="http://schemas.microsoft.com/office/drawing/2015/9/8/chartex" xmlns:cx2="http://schemas.microsoft.com/office/drawing/2015/10/21/chartex" xmlns:cx3="http://schemas.microsoft.com/office/drawing/2016/5/9/chartex" xmlns:cx4="http://schemas.microsoft.com/office/drawing/2016/5/10/chartex" xmlns:cx5="http://schemas.microsoft.com/office/drawing/2016/5/11/chartex" xmlns:cx6="http://schemas.microsoft.com/office/drawing/2016/5/12/chartex" xmlns:cx7="http://schemas.microsoft.com/office/drawing/2016/5/13/chartex" xmlns:cx8="http://schemas.microsoft.com/office/drawing/2016/5/14/chartex" xmlns:mc="http://schemas.openxmlformats.org/markup-compatibility/2006" xmlns:aink="http://schemas.microsoft.com/office/drawing/2016/ink" xmlns:am3d="http://schemas.microsoft.com/office/drawing/2017/model3d" xmlns:o="urn:schemas-microsoft-com:office:office" xmlns:oel="http://schemas.microsoft.com/office/2019/extlst" xmlns:r="http://schemas.openxmlformats.org/officeDocument/2006/relationships" xmlns:m="http://schemas.openxmlformats.org/officeDocument/2006/math" xmlns:v="urn:schemas-microsoft-com:vml" xmlns:wp14="http://schemas.microsoft.com/office/word/2010/wordprocessingDrawing" xmlns:wp="http://schemas.openxmlformats.org/drawingml/2006/wordprocessingDrawing" xmlns:w10="urn:schemas-microsoft-com:office:word" xmlns:w="http://schemas.openxmlformats.org/wordprocessingml/2006/main" xmlns:w14="http://schemas.microsoft.com/office/word/2010/wordml" xmlns:w15="http://schemas.microsoft.com/office/word/2012/wordml" xmlns:w16cex="http://schemas.microsoft.com/office/word/2018/wordml/cex" xmlns:w16cid="http://schemas.microsoft.com/office/word/2016/wordml/cid" xmlns:w16="http://schemas.microsoft.com/office/word/2018/wordml" xmlns:w16sdtdh="http://schemas.microsoft.com/office/word/2020/wordml/sdtdatahash" xmlns:w16se="http://schemas.microsoft.com/office/word/2015/wordml/symex" xmlns:wpg="http://schemas.microsoft.com/office/word/2010/wordprocessingGroup" xmlns:wpi="http://schemas.microsoft.com/office/word/2010/wordprocessingInk" xmlns:wne="http://schemas.microsoft.com/office/word/2006/wordml" xmlns:wps="http://schemas.microsoft.com/office/word/2010/wordprocessingShape" mc:Ignorable="w14 w15 w16se w16cid w16 w16cex w16sdtdh wp14">
   <w:abstractNum w:abstractNumId="0" w15:restartNumberingAfterBreak="0">
-    <w:nsid w:val="46661C9A"/>
+    <w:nsid w:val="D3BA1FBF"/>
     <w:multiLevelType w:val="hybridMultilevel"/>
     <w:tmpl w:val="934E79A6"/>
     <w:lvl w:ilvl="0" w:tplc="04090001">

</xml_diff>

<commit_message>
Refresh PowerShell website artifacts and runnable showcases
</commit_message>
<xml_diff>
--- a/Website/static/downloads/showcase/pswriteoffice/budget-forecast-review.docx
+++ b/Website/static/downloads/showcase/pswriteoffice/budget-forecast-review.docx
@@ -608,8 +608,8 @@
       </w:tr>
     </w:tbl>
     <w:sectPr>
-      <w:headerReference w:type="default" r:id="R4da9e0480f9c4774"/>
-      <w:footerReference w:type="default" r:id="R8492ad7e35e04d77"/>
+      <w:headerReference w:type="default" r:id="R2e8ef8b2c5134a8d"/>
+      <w:footerReference w:type="default" r:id="R7d869bec6f6a4389"/>
       <w:pgSz w:w="12240" w:h="15840" w:code="1"/>
       <w:pgMar w:top="1440" w:right="1440" w:bottom="1440" w:left="1440" w:header="720" w:footer="720" w:gutter="0"/>
     </w:sectPr>
@@ -689,7 +689,7 @@
 <file path=word/numbering.xml><?xml version="1.0" encoding="utf-8"?>
 <w:numbering xmlns:wpc="http://schemas.microsoft.com/office/word/2010/wordprocessingCanvas" xmlns:cx="http://schemas.microsoft.com/office/drawing/2014/chartex" xmlns:cx1="http://schemas.microsoft.com/office/drawing/2015/9/8/chartex" xmlns:cx2="http://schemas.microsoft.com/office/drawing/2015/10/21/chartex" xmlns:cx3="http://schemas.microsoft.com/office/drawing/2016/5/9/chartex" xmlns:cx4="http://schemas.microsoft.com/office/drawing/2016/5/10/chartex" xmlns:cx5="http://schemas.microsoft.com/office/drawing/2016/5/11/chartex" xmlns:cx6="http://schemas.microsoft.com/office/drawing/2016/5/12/chartex" xmlns:cx7="http://schemas.microsoft.com/office/drawing/2016/5/13/chartex" xmlns:cx8="http://schemas.microsoft.com/office/drawing/2016/5/14/chartex" xmlns:mc="http://schemas.openxmlformats.org/markup-compatibility/2006" xmlns:aink="http://schemas.microsoft.com/office/drawing/2016/ink" xmlns:am3d="http://schemas.microsoft.com/office/drawing/2017/model3d" xmlns:o="urn:schemas-microsoft-com:office:office" xmlns:oel="http://schemas.microsoft.com/office/2019/extlst" xmlns:r="http://schemas.openxmlformats.org/officeDocument/2006/relationships" xmlns:m="http://schemas.openxmlformats.org/officeDocument/2006/math" xmlns:v="urn:schemas-microsoft-com:vml" xmlns:wp14="http://schemas.microsoft.com/office/word/2010/wordprocessingDrawing" xmlns:wp="http://schemas.openxmlformats.org/drawingml/2006/wordprocessingDrawing" xmlns:w10="urn:schemas-microsoft-com:office:word" xmlns:w="http://schemas.openxmlformats.org/wordprocessingml/2006/main" xmlns:w14="http://schemas.microsoft.com/office/word/2010/wordml" xmlns:w15="http://schemas.microsoft.com/office/word/2012/wordml" xmlns:w16cex="http://schemas.microsoft.com/office/word/2018/wordml/cex" xmlns:w16cid="http://schemas.microsoft.com/office/word/2016/wordml/cid" xmlns:w16="http://schemas.microsoft.com/office/word/2018/wordml" xmlns:w16sdtdh="http://schemas.microsoft.com/office/word/2020/wordml/sdtdatahash" xmlns:w16se="http://schemas.microsoft.com/office/word/2015/wordml/symex" xmlns:wpg="http://schemas.microsoft.com/office/word/2010/wordprocessingGroup" xmlns:wpi="http://schemas.microsoft.com/office/word/2010/wordprocessingInk" xmlns:wne="http://schemas.microsoft.com/office/word/2006/wordml" xmlns:wps="http://schemas.microsoft.com/office/word/2010/wordprocessingShape" mc:Ignorable="w14 w15 w16se w16cid w16 w16cex w16sdtdh wp14">
   <w:abstractNum w:abstractNumId="0" w15:restartNumberingAfterBreak="0">
-    <w:nsid w:val="D3BA1FBF"/>
+    <w:nsid w:val="1E39BFAA"/>
     <w:multiLevelType w:val="hybridMultilevel"/>
     <w:tmpl w:val="934E79A6"/>
     <w:lvl w:ilvl="0" w:tplc="04090001">

</xml_diff>

<commit_message>
Refresh module help and website examples from the current API
</commit_message>
<xml_diff>
--- a/Website/static/downloads/showcase/pswriteoffice/budget-forecast-review.docx
+++ b/Website/static/downloads/showcase/pswriteoffice/budget-forecast-review.docx
@@ -608,8 +608,8 @@
       </w:tr>
     </w:tbl>
     <w:sectPr>
-      <w:headerReference w:type="default" r:id="R2e8ef8b2c5134a8d"/>
-      <w:footerReference w:type="default" r:id="R7d869bec6f6a4389"/>
+      <w:headerReference w:type="default" r:id="Rcda3248e38e1437b"/>
+      <w:footerReference w:type="default" r:id="R6cac29f99fa14536"/>
       <w:pgSz w:w="12240" w:h="15840" w:code="1"/>
       <w:pgMar w:top="1440" w:right="1440" w:bottom="1440" w:left="1440" w:header="720" w:footer="720" w:gutter="0"/>
     </w:sectPr>
@@ -689,7 +689,7 @@
 <file path=word/numbering.xml><?xml version="1.0" encoding="utf-8"?>
 <w:numbering xmlns:wpc="http://schemas.microsoft.com/office/word/2010/wordprocessingCanvas" xmlns:cx="http://schemas.microsoft.com/office/drawing/2014/chartex" xmlns:cx1="http://schemas.microsoft.com/office/drawing/2015/9/8/chartex" xmlns:cx2="http://schemas.microsoft.com/office/drawing/2015/10/21/chartex" xmlns:cx3="http://schemas.microsoft.com/office/drawing/2016/5/9/chartex" xmlns:cx4="http://schemas.microsoft.com/office/drawing/2016/5/10/chartex" xmlns:cx5="http://schemas.microsoft.com/office/drawing/2016/5/11/chartex" xmlns:cx6="http://schemas.microsoft.com/office/drawing/2016/5/12/chartex" xmlns:cx7="http://schemas.microsoft.com/office/drawing/2016/5/13/chartex" xmlns:cx8="http://schemas.microsoft.com/office/drawing/2016/5/14/chartex" xmlns:mc="http://schemas.openxmlformats.org/markup-compatibility/2006" xmlns:aink="http://schemas.microsoft.com/office/drawing/2016/ink" xmlns:am3d="http://schemas.microsoft.com/office/drawing/2017/model3d" xmlns:o="urn:schemas-microsoft-com:office:office" xmlns:oel="http://schemas.microsoft.com/office/2019/extlst" xmlns:r="http://schemas.openxmlformats.org/officeDocument/2006/relationships" xmlns:m="http://schemas.openxmlformats.org/officeDocument/2006/math" xmlns:v="urn:schemas-microsoft-com:vml" xmlns:wp14="http://schemas.microsoft.com/office/word/2010/wordprocessingDrawing" xmlns:wp="http://schemas.openxmlformats.org/drawingml/2006/wordprocessingDrawing" xmlns:w10="urn:schemas-microsoft-com:office:word" xmlns:w="http://schemas.openxmlformats.org/wordprocessingml/2006/main" xmlns:w14="http://schemas.microsoft.com/office/word/2010/wordml" xmlns:w15="http://schemas.microsoft.com/office/word/2012/wordml" xmlns:w16cex="http://schemas.microsoft.com/office/word/2018/wordml/cex" xmlns:w16cid="http://schemas.microsoft.com/office/word/2016/wordml/cid" xmlns:w16="http://schemas.microsoft.com/office/word/2018/wordml" xmlns:w16sdtdh="http://schemas.microsoft.com/office/word/2020/wordml/sdtdatahash" xmlns:w16se="http://schemas.microsoft.com/office/word/2015/wordml/symex" xmlns:wpg="http://schemas.microsoft.com/office/word/2010/wordprocessingGroup" xmlns:wpi="http://schemas.microsoft.com/office/word/2010/wordprocessingInk" xmlns:wne="http://schemas.microsoft.com/office/word/2006/wordml" xmlns:wps="http://schemas.microsoft.com/office/word/2010/wordprocessingShape" mc:Ignorable="w14 w15 w16se w16cid w16 w16cex w16sdtdh wp14">
   <w:abstractNum w:abstractNumId="0" w15:restartNumberingAfterBreak="0">
-    <w:nsid w:val="1E39BFAA"/>
+    <w:nsid w:val="908E8CAE"/>
     <w:multiLevelType w:val="hybridMultilevel"/>
     <w:tmpl w:val="934E79A6"/>
     <w:lvl w:ilvl="0" w:tplc="04090001">

</xml_diff>

<commit_message>
Refresh command documentation and current API links
</commit_message>
<xml_diff>
--- a/Website/static/downloads/showcase/pswriteoffice/budget-forecast-review.docx
+++ b/Website/static/downloads/showcase/pswriteoffice/budget-forecast-review.docx
@@ -608,8 +608,8 @@
       </w:tr>
     </w:tbl>
     <w:sectPr>
-      <w:headerReference w:type="default" r:id="Rcda3248e38e1437b"/>
-      <w:footerReference w:type="default" r:id="R6cac29f99fa14536"/>
+      <w:headerReference w:type="default" r:id="R14802ffe989a47e4"/>
+      <w:footerReference w:type="default" r:id="R67d0e023a2d04f98"/>
       <w:pgSz w:w="12240" w:h="15840" w:code="1"/>
       <w:pgMar w:top="1440" w:right="1440" w:bottom="1440" w:left="1440" w:header="720" w:footer="720" w:gutter="0"/>
     </w:sectPr>
@@ -689,7 +689,7 @@
 <file path=word/numbering.xml><?xml version="1.0" encoding="utf-8"?>
 <w:numbering xmlns:wpc="http://schemas.microsoft.com/office/word/2010/wordprocessingCanvas" xmlns:cx="http://schemas.microsoft.com/office/drawing/2014/chartex" xmlns:cx1="http://schemas.microsoft.com/office/drawing/2015/9/8/chartex" xmlns:cx2="http://schemas.microsoft.com/office/drawing/2015/10/21/chartex" xmlns:cx3="http://schemas.microsoft.com/office/drawing/2016/5/9/chartex" xmlns:cx4="http://schemas.microsoft.com/office/drawing/2016/5/10/chartex" xmlns:cx5="http://schemas.microsoft.com/office/drawing/2016/5/11/chartex" xmlns:cx6="http://schemas.microsoft.com/office/drawing/2016/5/12/chartex" xmlns:cx7="http://schemas.microsoft.com/office/drawing/2016/5/13/chartex" xmlns:cx8="http://schemas.microsoft.com/office/drawing/2016/5/14/chartex" xmlns:mc="http://schemas.openxmlformats.org/markup-compatibility/2006" xmlns:aink="http://schemas.microsoft.com/office/drawing/2016/ink" xmlns:am3d="http://schemas.microsoft.com/office/drawing/2017/model3d" xmlns:o="urn:schemas-microsoft-com:office:office" xmlns:oel="http://schemas.microsoft.com/office/2019/extlst" xmlns:r="http://schemas.openxmlformats.org/officeDocument/2006/relationships" xmlns:m="http://schemas.openxmlformats.org/officeDocument/2006/math" xmlns:v="urn:schemas-microsoft-com:vml" xmlns:wp14="http://schemas.microsoft.com/office/word/2010/wordprocessingDrawing" xmlns:wp="http://schemas.openxmlformats.org/drawingml/2006/wordprocessingDrawing" xmlns:w10="urn:schemas-microsoft-com:office:word" xmlns:w="http://schemas.openxmlformats.org/wordprocessingml/2006/main" xmlns:w14="http://schemas.microsoft.com/office/word/2010/wordml" xmlns:w15="http://schemas.microsoft.com/office/word/2012/wordml" xmlns:w16cex="http://schemas.microsoft.com/office/word/2018/wordml/cex" xmlns:w16cid="http://schemas.microsoft.com/office/word/2016/wordml/cid" xmlns:w16="http://schemas.microsoft.com/office/word/2018/wordml" xmlns:w16sdtdh="http://schemas.microsoft.com/office/word/2020/wordml/sdtdatahash" xmlns:w16se="http://schemas.microsoft.com/office/word/2015/wordml/symex" xmlns:wpg="http://schemas.microsoft.com/office/word/2010/wordprocessingGroup" xmlns:wpi="http://schemas.microsoft.com/office/word/2010/wordprocessingInk" xmlns:wne="http://schemas.microsoft.com/office/word/2006/wordml" xmlns:wps="http://schemas.microsoft.com/office/word/2010/wordprocessingShape" mc:Ignorable="w14 w15 w16se w16cid w16 w16cex w16sdtdh wp14">
   <w:abstractNum w:abstractNumId="0" w15:restartNumberingAfterBreak="0">
-    <w:nsid w:val="908E8CAE"/>
+    <w:nsid w:val="4CEEA1C0"/>
     <w:multiLevelType w:val="hybridMultilevel"/>
     <w:tmpl w:val="934E79A6"/>
     <w:lvl w:ilvl="0" w:tplc="04090001">

</xml_diff>

<commit_message>
Refresh generated command evidence and source links
</commit_message>
<xml_diff>
--- a/Website/static/downloads/showcase/pswriteoffice/budget-forecast-review.docx
+++ b/Website/static/downloads/showcase/pswriteoffice/budget-forecast-review.docx
@@ -608,8 +608,8 @@
       </w:tr>
     </w:tbl>
     <w:sectPr>
-      <w:headerReference w:type="default" r:id="R14802ffe989a47e4"/>
-      <w:footerReference w:type="default" r:id="R67d0e023a2d04f98"/>
+      <w:headerReference w:type="default" r:id="R108c6e47efb04fbc"/>
+      <w:footerReference w:type="default" r:id="R72c969a9a09f456d"/>
       <w:pgSz w:w="12240" w:h="15840" w:code="1"/>
       <w:pgMar w:top="1440" w:right="1440" w:bottom="1440" w:left="1440" w:header="720" w:footer="720" w:gutter="0"/>
     </w:sectPr>
@@ -689,7 +689,7 @@
 <file path=word/numbering.xml><?xml version="1.0" encoding="utf-8"?>
 <w:numbering xmlns:wpc="http://schemas.microsoft.com/office/word/2010/wordprocessingCanvas" xmlns:cx="http://schemas.microsoft.com/office/drawing/2014/chartex" xmlns:cx1="http://schemas.microsoft.com/office/drawing/2015/9/8/chartex" xmlns:cx2="http://schemas.microsoft.com/office/drawing/2015/10/21/chartex" xmlns:cx3="http://schemas.microsoft.com/office/drawing/2016/5/9/chartex" xmlns:cx4="http://schemas.microsoft.com/office/drawing/2016/5/10/chartex" xmlns:cx5="http://schemas.microsoft.com/office/drawing/2016/5/11/chartex" xmlns:cx6="http://schemas.microsoft.com/office/drawing/2016/5/12/chartex" xmlns:cx7="http://schemas.microsoft.com/office/drawing/2016/5/13/chartex" xmlns:cx8="http://schemas.microsoft.com/office/drawing/2016/5/14/chartex" xmlns:mc="http://schemas.openxmlformats.org/markup-compatibility/2006" xmlns:aink="http://schemas.microsoft.com/office/drawing/2016/ink" xmlns:am3d="http://schemas.microsoft.com/office/drawing/2017/model3d" xmlns:o="urn:schemas-microsoft-com:office:office" xmlns:oel="http://schemas.microsoft.com/office/2019/extlst" xmlns:r="http://schemas.openxmlformats.org/officeDocument/2006/relationships" xmlns:m="http://schemas.openxmlformats.org/officeDocument/2006/math" xmlns:v="urn:schemas-microsoft-com:vml" xmlns:wp14="http://schemas.microsoft.com/office/word/2010/wordprocessingDrawing" xmlns:wp="http://schemas.openxmlformats.org/drawingml/2006/wordprocessingDrawing" xmlns:w10="urn:schemas-microsoft-com:office:word" xmlns:w="http://schemas.openxmlformats.org/wordprocessingml/2006/main" xmlns:w14="http://schemas.microsoft.com/office/word/2010/wordml" xmlns:w15="http://schemas.microsoft.com/office/word/2012/wordml" xmlns:w16cex="http://schemas.microsoft.com/office/word/2018/wordml/cex" xmlns:w16cid="http://schemas.microsoft.com/office/word/2016/wordml/cid" xmlns:w16="http://schemas.microsoft.com/office/word/2018/wordml" xmlns:w16sdtdh="http://schemas.microsoft.com/office/word/2020/wordml/sdtdatahash" xmlns:w16se="http://schemas.microsoft.com/office/word/2015/wordml/symex" xmlns:wpg="http://schemas.microsoft.com/office/word/2010/wordprocessingGroup" xmlns:wpi="http://schemas.microsoft.com/office/word/2010/wordprocessingInk" xmlns:wne="http://schemas.microsoft.com/office/word/2006/wordml" xmlns:wps="http://schemas.microsoft.com/office/word/2010/wordprocessingShape" mc:Ignorable="w14 w15 w16se w16cid w16 w16cex w16sdtdh wp14">
   <w:abstractNum w:abstractNumId="0" w15:restartNumberingAfterBreak="0">
-    <w:nsid w:val="4CEEA1C0"/>
+    <w:nsid w:val="8D2B718C"/>
     <w:multiLevelType w:val="hybridMultilevel"/>
     <w:tmpl w:val="934E79A6"/>
     <w:lvl w:ilvl="0" w:tplc="04090001">

</xml_diff>

<commit_message>
Refresh shared image documentation and conversion routes
</commit_message>
<xml_diff>
--- a/Website/static/downloads/showcase/pswriteoffice/budget-forecast-review.docx
+++ b/Website/static/downloads/showcase/pswriteoffice/budget-forecast-review.docx
@@ -608,8 +608,8 @@
       </w:tr>
     </w:tbl>
     <w:sectPr>
-      <w:headerReference w:type="default" r:id="R108c6e47efb04fbc"/>
-      <w:footerReference w:type="default" r:id="R72c969a9a09f456d"/>
+      <w:headerReference w:type="default" r:id="R463e353708474acc"/>
+      <w:footerReference w:type="default" r:id="R554e0df6bcb04956"/>
       <w:pgSz w:w="12240" w:h="15840" w:code="1"/>
       <w:pgMar w:top="1440" w:right="1440" w:bottom="1440" w:left="1440" w:header="720" w:footer="720" w:gutter="0"/>
     </w:sectPr>
@@ -689,7 +689,7 @@
 <file path=word/numbering.xml><?xml version="1.0" encoding="utf-8"?>
 <w:numbering xmlns:wpc="http://schemas.microsoft.com/office/word/2010/wordprocessingCanvas" xmlns:cx="http://schemas.microsoft.com/office/drawing/2014/chartex" xmlns:cx1="http://schemas.microsoft.com/office/drawing/2015/9/8/chartex" xmlns:cx2="http://schemas.microsoft.com/office/drawing/2015/10/21/chartex" xmlns:cx3="http://schemas.microsoft.com/office/drawing/2016/5/9/chartex" xmlns:cx4="http://schemas.microsoft.com/office/drawing/2016/5/10/chartex" xmlns:cx5="http://schemas.microsoft.com/office/drawing/2016/5/11/chartex" xmlns:cx6="http://schemas.microsoft.com/office/drawing/2016/5/12/chartex" xmlns:cx7="http://schemas.microsoft.com/office/drawing/2016/5/13/chartex" xmlns:cx8="http://schemas.microsoft.com/office/drawing/2016/5/14/chartex" xmlns:mc="http://schemas.openxmlformats.org/markup-compatibility/2006" xmlns:aink="http://schemas.microsoft.com/office/drawing/2016/ink" xmlns:am3d="http://schemas.microsoft.com/office/drawing/2017/model3d" xmlns:o="urn:schemas-microsoft-com:office:office" xmlns:oel="http://schemas.microsoft.com/office/2019/extlst" xmlns:r="http://schemas.openxmlformats.org/officeDocument/2006/relationships" xmlns:m="http://schemas.openxmlformats.org/officeDocument/2006/math" xmlns:v="urn:schemas-microsoft-com:vml" xmlns:wp14="http://schemas.microsoft.com/office/word/2010/wordprocessingDrawing" xmlns:wp="http://schemas.openxmlformats.org/drawingml/2006/wordprocessingDrawing" xmlns:w10="urn:schemas-microsoft-com:office:word" xmlns:w="http://schemas.openxmlformats.org/wordprocessingml/2006/main" xmlns:w14="http://schemas.microsoft.com/office/word/2010/wordml" xmlns:w15="http://schemas.microsoft.com/office/word/2012/wordml" xmlns:w16cex="http://schemas.microsoft.com/office/word/2018/wordml/cex" xmlns:w16cid="http://schemas.microsoft.com/office/word/2016/wordml/cid" xmlns:w16="http://schemas.microsoft.com/office/word/2018/wordml" xmlns:w16sdtdh="http://schemas.microsoft.com/office/word/2020/wordml/sdtdatahash" xmlns:w16se="http://schemas.microsoft.com/office/word/2015/wordml/symex" xmlns:wpg="http://schemas.microsoft.com/office/word/2010/wordprocessingGroup" xmlns:wpi="http://schemas.microsoft.com/office/word/2010/wordprocessingInk" xmlns:wne="http://schemas.microsoft.com/office/word/2006/wordml" xmlns:wps="http://schemas.microsoft.com/office/word/2010/wordprocessingShape" mc:Ignorable="w14 w15 w16se w16cid w16 w16cex w16sdtdh wp14">
   <w:abstractNum w:abstractNumId="0" w15:restartNumberingAfterBreak="0">
-    <w:nsid w:val="8D2B718C"/>
+    <w:nsid w:val="498EA1A0"/>
     <w:multiLevelType w:val="hybridMultilevel"/>
     <w:tmpl w:val="934E79A6"/>
     <w:lvl w:ilvl="0" w:tplc="04090001">

</xml_diff>

<commit_message>
Refresh packaged command evidence and source references
</commit_message>
<xml_diff>
--- a/Website/static/downloads/showcase/pswriteoffice/budget-forecast-review.docx
+++ b/Website/static/downloads/showcase/pswriteoffice/budget-forecast-review.docx
@@ -608,8 +608,8 @@
       </w:tr>
     </w:tbl>
     <w:sectPr>
-      <w:headerReference w:type="default" r:id="R463e353708474acc"/>
-      <w:footerReference w:type="default" r:id="R554e0df6bcb04956"/>
+      <w:headerReference w:type="default" r:id="Rbba68681fcd14855"/>
+      <w:footerReference w:type="default" r:id="R58632b6557f544d6"/>
       <w:pgSz w:w="12240" w:h="15840" w:code="1"/>
       <w:pgMar w:top="1440" w:right="1440" w:bottom="1440" w:left="1440" w:header="720" w:footer="720" w:gutter="0"/>
     </w:sectPr>
@@ -689,7 +689,7 @@
 <file path=word/numbering.xml><?xml version="1.0" encoding="utf-8"?>
 <w:numbering xmlns:wpc="http://schemas.microsoft.com/office/word/2010/wordprocessingCanvas" xmlns:cx="http://schemas.microsoft.com/office/drawing/2014/chartex" xmlns:cx1="http://schemas.microsoft.com/office/drawing/2015/9/8/chartex" xmlns:cx2="http://schemas.microsoft.com/office/drawing/2015/10/21/chartex" xmlns:cx3="http://schemas.microsoft.com/office/drawing/2016/5/9/chartex" xmlns:cx4="http://schemas.microsoft.com/office/drawing/2016/5/10/chartex" xmlns:cx5="http://schemas.microsoft.com/office/drawing/2016/5/11/chartex" xmlns:cx6="http://schemas.microsoft.com/office/drawing/2016/5/12/chartex" xmlns:cx7="http://schemas.microsoft.com/office/drawing/2016/5/13/chartex" xmlns:cx8="http://schemas.microsoft.com/office/drawing/2016/5/14/chartex" xmlns:mc="http://schemas.openxmlformats.org/markup-compatibility/2006" xmlns:aink="http://schemas.microsoft.com/office/drawing/2016/ink" xmlns:am3d="http://schemas.microsoft.com/office/drawing/2017/model3d" xmlns:o="urn:schemas-microsoft-com:office:office" xmlns:oel="http://schemas.microsoft.com/office/2019/extlst" xmlns:r="http://schemas.openxmlformats.org/officeDocument/2006/relationships" xmlns:m="http://schemas.openxmlformats.org/officeDocument/2006/math" xmlns:v="urn:schemas-microsoft-com:vml" xmlns:wp14="http://schemas.microsoft.com/office/word/2010/wordprocessingDrawing" xmlns:wp="http://schemas.openxmlformats.org/drawingml/2006/wordprocessingDrawing" xmlns:w10="urn:schemas-microsoft-com:office:word" xmlns:w="http://schemas.openxmlformats.org/wordprocessingml/2006/main" xmlns:w14="http://schemas.microsoft.com/office/word/2010/wordml" xmlns:w15="http://schemas.microsoft.com/office/word/2012/wordml" xmlns:w16cex="http://schemas.microsoft.com/office/word/2018/wordml/cex" xmlns:w16cid="http://schemas.microsoft.com/office/word/2016/wordml/cid" xmlns:w16="http://schemas.microsoft.com/office/word/2018/wordml" xmlns:w16sdtdh="http://schemas.microsoft.com/office/word/2020/wordml/sdtdatahash" xmlns:w16se="http://schemas.microsoft.com/office/word/2015/wordml/symex" xmlns:wpg="http://schemas.microsoft.com/office/word/2010/wordprocessingGroup" xmlns:wpi="http://schemas.microsoft.com/office/word/2010/wordprocessingInk" xmlns:wne="http://schemas.microsoft.com/office/word/2006/wordml" xmlns:wps="http://schemas.microsoft.com/office/word/2010/wordprocessingShape" mc:Ignorable="w14 w15 w16se w16cid w16 w16cex w16sdtdh wp14">
   <w:abstractNum w:abstractNumId="0" w15:restartNumberingAfterBreak="0">
-    <w:nsid w:val="498EA1A0"/>
+    <w:nsid w:val="9F578070"/>
     <w:multiLevelType w:val="hybridMultilevel"/>
     <w:tmpl w:val="934E79A6"/>
     <w:lvl w:ilvl="0" w:tplc="04090001">

</xml_diff>

<commit_message>
Refresh PowerShell showcase and API evidence for version 3.5.3
</commit_message>
<xml_diff>
--- a/Website/static/downloads/showcase/pswriteoffice/budget-forecast-review.docx
+++ b/Website/static/downloads/showcase/pswriteoffice/budget-forecast-review.docx
@@ -608,8 +608,8 @@
       </w:tr>
     </w:tbl>
     <w:sectPr>
-      <w:headerReference w:type="default" r:id="R910be6c7faaf4a6a"/>
-      <w:footerReference w:type="default" r:id="R56120b11eef14ea3"/>
+      <w:headerReference w:type="default" r:id="R9babab175f35414e"/>
+      <w:footerReference w:type="default" r:id="Rc9fb159b97bd4c84"/>
       <w:pgSz w:w="12240" w:h="15840" w:code="1"/>
       <w:pgMar w:top="1440" w:right="1440" w:bottom="1440" w:left="1440" w:header="720" w:footer="720" w:gutter="0"/>
     </w:sectPr>
@@ -689,7 +689,7 @@
 <file path=word/numbering.xml><?xml version="1.0" encoding="utf-8"?>
 <w:numbering xmlns:wpc="http://schemas.microsoft.com/office/word/2010/wordprocessingCanvas" xmlns:cx="http://schemas.microsoft.com/office/drawing/2014/chartex" xmlns:cx1="http://schemas.microsoft.com/office/drawing/2015/9/8/chartex" xmlns:cx2="http://schemas.microsoft.com/office/drawing/2015/10/21/chartex" xmlns:cx3="http://schemas.microsoft.com/office/drawing/2016/5/9/chartex" xmlns:cx4="http://schemas.microsoft.com/office/drawing/2016/5/10/chartex" xmlns:cx5="http://schemas.microsoft.com/office/drawing/2016/5/11/chartex" xmlns:cx6="http://schemas.microsoft.com/office/drawing/2016/5/12/chartex" xmlns:cx7="http://schemas.microsoft.com/office/drawing/2016/5/13/chartex" xmlns:cx8="http://schemas.microsoft.com/office/drawing/2016/5/14/chartex" xmlns:mc="http://schemas.openxmlformats.org/markup-compatibility/2006" xmlns:aink="http://schemas.microsoft.com/office/drawing/2016/ink" xmlns:am3d="http://schemas.microsoft.com/office/drawing/2017/model3d" xmlns:o="urn:schemas-microsoft-com:office:office" xmlns:oel="http://schemas.microsoft.com/office/2019/extlst" xmlns:r="http://schemas.openxmlformats.org/officeDocument/2006/relationships" xmlns:m="http://schemas.openxmlformats.org/officeDocument/2006/math" xmlns:v="urn:schemas-microsoft-com:vml" xmlns:wp14="http://schemas.microsoft.com/office/word/2010/wordprocessingDrawing" xmlns:wp="http://schemas.openxmlformats.org/drawingml/2006/wordprocessingDrawing" xmlns:w10="urn:schemas-microsoft-com:office:word" xmlns:w="http://schemas.openxmlformats.org/wordprocessingml/2006/main" xmlns:w14="http://schemas.microsoft.com/office/word/2010/wordml" xmlns:w15="http://schemas.microsoft.com/office/word/2012/wordml" xmlns:w16cex="http://schemas.microsoft.com/office/word/2018/wordml/cex" xmlns:w16cid="http://schemas.microsoft.com/office/word/2016/wordml/cid" xmlns:w16="http://schemas.microsoft.com/office/word/2018/wordml" xmlns:w16sdtdh="http://schemas.microsoft.com/office/word/2020/wordml/sdtdatahash" xmlns:w16se="http://schemas.microsoft.com/office/word/2015/wordml/symex" xmlns:wpg="http://schemas.microsoft.com/office/word/2010/wordprocessingGroup" xmlns:wpi="http://schemas.microsoft.com/office/word/2010/wordprocessingInk" xmlns:wne="http://schemas.microsoft.com/office/word/2006/wordml" xmlns:wps="http://schemas.microsoft.com/office/word/2010/wordprocessingShape" mc:Ignorable="w14 w15 w16se w16cid w16 w16cex w16sdtdh wp14">
   <w:abstractNum w:abstractNumId="0" w15:restartNumberingAfterBreak="0">
-    <w:nsid w:val="E4F2EC56"/>
+    <w:nsid w:val="A91E3670"/>
     <w:multiLevelType w:val="hybridMultilevel"/>
     <w:tmpl w:val="934E79A6"/>
     <w:lvl w:ilvl="0" w:tplc="04090001">

</xml_diff>

<commit_message>
Refresh qualified command help and executed PowerShell showcases
</commit_message>
<xml_diff>
--- a/Website/static/downloads/showcase/pswriteoffice/budget-forecast-review.docx
+++ b/Website/static/downloads/showcase/pswriteoffice/budget-forecast-review.docx
@@ -608,8 +608,8 @@
       </w:tr>
     </w:tbl>
     <w:sectPr>
-      <w:headerReference w:type="default" r:id="Rbba68681fcd14855"/>
-      <w:footerReference w:type="default" r:id="R58632b6557f544d6"/>
+      <w:headerReference w:type="default" r:id="R1b705d60ff0a45de"/>
+      <w:footerReference w:type="default" r:id="Re79e069b4d794708"/>
       <w:pgSz w:w="12240" w:h="15840" w:code="1"/>
       <w:pgMar w:top="1440" w:right="1440" w:bottom="1440" w:left="1440" w:header="720" w:footer="720" w:gutter="0"/>
     </w:sectPr>
@@ -689,7 +689,7 @@
 <file path=word/numbering.xml><?xml version="1.0" encoding="utf-8"?>
 <w:numbering xmlns:wpc="http://schemas.microsoft.com/office/word/2010/wordprocessingCanvas" xmlns:cx="http://schemas.microsoft.com/office/drawing/2014/chartex" xmlns:cx1="http://schemas.microsoft.com/office/drawing/2015/9/8/chartex" xmlns:cx2="http://schemas.microsoft.com/office/drawing/2015/10/21/chartex" xmlns:cx3="http://schemas.microsoft.com/office/drawing/2016/5/9/chartex" xmlns:cx4="http://schemas.microsoft.com/office/drawing/2016/5/10/chartex" xmlns:cx5="http://schemas.microsoft.com/office/drawing/2016/5/11/chartex" xmlns:cx6="http://schemas.microsoft.com/office/drawing/2016/5/12/chartex" xmlns:cx7="http://schemas.microsoft.com/office/drawing/2016/5/13/chartex" xmlns:cx8="http://schemas.microsoft.com/office/drawing/2016/5/14/chartex" xmlns:mc="http://schemas.openxmlformats.org/markup-compatibility/2006" xmlns:aink="http://schemas.microsoft.com/office/drawing/2016/ink" xmlns:am3d="http://schemas.microsoft.com/office/drawing/2017/model3d" xmlns:o="urn:schemas-microsoft-com:office:office" xmlns:oel="http://schemas.microsoft.com/office/2019/extlst" xmlns:r="http://schemas.openxmlformats.org/officeDocument/2006/relationships" xmlns:m="http://schemas.openxmlformats.org/officeDocument/2006/math" xmlns:v="urn:schemas-microsoft-com:vml" xmlns:wp14="http://schemas.microsoft.com/office/word/2010/wordprocessingDrawing" xmlns:wp="http://schemas.openxmlformats.org/drawingml/2006/wordprocessingDrawing" xmlns:w10="urn:schemas-microsoft-com:office:word" xmlns:w="http://schemas.openxmlformats.org/wordprocessingml/2006/main" xmlns:w14="http://schemas.microsoft.com/office/word/2010/wordml" xmlns:w15="http://schemas.microsoft.com/office/word/2012/wordml" xmlns:w16cex="http://schemas.microsoft.com/office/word/2018/wordml/cex" xmlns:w16cid="http://schemas.microsoft.com/office/word/2016/wordml/cid" xmlns:w16="http://schemas.microsoft.com/office/word/2018/wordml" xmlns:w16sdtdh="http://schemas.microsoft.com/office/word/2020/wordml/sdtdatahash" xmlns:w16se="http://schemas.microsoft.com/office/word/2015/wordml/symex" xmlns:wpg="http://schemas.microsoft.com/office/word/2010/wordprocessingGroup" xmlns:wpi="http://schemas.microsoft.com/office/word/2010/wordprocessingInk" xmlns:wne="http://schemas.microsoft.com/office/word/2006/wordml" xmlns:wps="http://schemas.microsoft.com/office/word/2010/wordprocessingShape" mc:Ignorable="w14 w15 w16se w16cid w16 w16cex w16sdtdh wp14">
   <w:abstractNum w:abstractNumId="0" w15:restartNumberingAfterBreak="0">
-    <w:nsid w:val="9F578070"/>
+    <w:nsid w:val="596147F0"/>
     <w:multiLevelType w:val="hybridMultilevel"/>
     <w:tmpl w:val="934E79A6"/>
     <w:lvl w:ilvl="0" w:tplc="04090001">

</xml_diff>

<commit_message>
Expand Excel formula support and reduce lookup allocations (#3227)
Calculate composed lookup fallbacks and dependent totals, expand lookup, reference, array and named-expression support, and preserve native blank and typed-error behavior. Reduce formula allocation through shared-string snapshots, lazy lookup sources and per-pass name catalogs.

Validate native Excel values and spills, supported targets and equivalent report and binary-search workloads.

Fixes #3226.
</commit_message>
<xml_diff>
--- a/Website/static/downloads/showcase/pswriteoffice/budget-forecast-review.docx
+++ b/Website/static/downloads/showcase/pswriteoffice/budget-forecast-review.docx
@@ -608,8 +608,8 @@
       </w:tr>
     </w:tbl>
     <w:sectPr>
-      <w:headerReference w:type="default" r:id="R910be6c7faaf4a6a"/>
-      <w:footerReference w:type="default" r:id="R56120b11eef14ea3"/>
+      <w:headerReference w:type="default" r:id="R9babab175f35414e"/>
+      <w:footerReference w:type="default" r:id="Rc9fb159b97bd4c84"/>
       <w:pgSz w:w="12240" w:h="15840" w:code="1"/>
       <w:pgMar w:top="1440" w:right="1440" w:bottom="1440" w:left="1440" w:header="720" w:footer="720" w:gutter="0"/>
     </w:sectPr>
@@ -689,7 +689,7 @@
 <file path=word/numbering.xml><?xml version="1.0" encoding="utf-8"?>
 <w:numbering xmlns:wpc="http://schemas.microsoft.com/office/word/2010/wordprocessingCanvas" xmlns:cx="http://schemas.microsoft.com/office/drawing/2014/chartex" xmlns:cx1="http://schemas.microsoft.com/office/drawing/2015/9/8/chartex" xmlns:cx2="http://schemas.microsoft.com/office/drawing/2015/10/21/chartex" xmlns:cx3="http://schemas.microsoft.com/office/drawing/2016/5/9/chartex" xmlns:cx4="http://schemas.microsoft.com/office/drawing/2016/5/10/chartex" xmlns:cx5="http://schemas.microsoft.com/office/drawing/2016/5/11/chartex" xmlns:cx6="http://schemas.microsoft.com/office/drawing/2016/5/12/chartex" xmlns:cx7="http://schemas.microsoft.com/office/drawing/2016/5/13/chartex" xmlns:cx8="http://schemas.microsoft.com/office/drawing/2016/5/14/chartex" xmlns:mc="http://schemas.openxmlformats.org/markup-compatibility/2006" xmlns:aink="http://schemas.microsoft.com/office/drawing/2016/ink" xmlns:am3d="http://schemas.microsoft.com/office/drawing/2017/model3d" xmlns:o="urn:schemas-microsoft-com:office:office" xmlns:oel="http://schemas.microsoft.com/office/2019/extlst" xmlns:r="http://schemas.openxmlformats.org/officeDocument/2006/relationships" xmlns:m="http://schemas.openxmlformats.org/officeDocument/2006/math" xmlns:v="urn:schemas-microsoft-com:vml" xmlns:wp14="http://schemas.microsoft.com/office/word/2010/wordprocessingDrawing" xmlns:wp="http://schemas.openxmlformats.org/drawingml/2006/wordprocessingDrawing" xmlns:w10="urn:schemas-microsoft-com:office:word" xmlns:w="http://schemas.openxmlformats.org/wordprocessingml/2006/main" xmlns:w14="http://schemas.microsoft.com/office/word/2010/wordml" xmlns:w15="http://schemas.microsoft.com/office/word/2012/wordml" xmlns:w16cex="http://schemas.microsoft.com/office/word/2018/wordml/cex" xmlns:w16cid="http://schemas.microsoft.com/office/word/2016/wordml/cid" xmlns:w16="http://schemas.microsoft.com/office/word/2018/wordml" xmlns:w16sdtdh="http://schemas.microsoft.com/office/word/2020/wordml/sdtdatahash" xmlns:w16se="http://schemas.microsoft.com/office/word/2015/wordml/symex" xmlns:wpg="http://schemas.microsoft.com/office/word/2010/wordprocessingGroup" xmlns:wpi="http://schemas.microsoft.com/office/word/2010/wordprocessingInk" xmlns:wne="http://schemas.microsoft.com/office/word/2006/wordml" xmlns:wps="http://schemas.microsoft.com/office/word/2010/wordprocessingShape" mc:Ignorable="w14 w15 w16se w16cid w16 w16cex w16sdtdh wp14">
   <w:abstractNum w:abstractNumId="0" w15:restartNumberingAfterBreak="0">
-    <w:nsid w:val="E4F2EC56"/>
+    <w:nsid w:val="A91E3670"/>
     <w:multiLevelType w:val="hybridMultilevel"/>
     <w:tmpl w:val="934E79A6"/>
     <w:lvl w:ilvl="0" w:tplc="04090001">

</xml_diff>